<commit_message>
Paper v3: separate cover page (PDF and DOCX), standalone cover PDF
</commit_message>
<xml_diff>
--- a/paper/v3/Droplet_Intelligence_Paper_v3.docx
+++ b/paper/v3/Droplet_Intelligence_Paper_v3.docx
@@ -2,6 +2,186 @@
 <file path=word/document.xml><?xml version="1.0" encoding="utf-8"?>
 <w:document xmlns:wpc="http://schemas.microsoft.com/office/word/2010/wordprocessingCanvas" xmlns:mo="http://schemas.microsoft.com/office/mac/office/2008/main" xmlns:mc="http://schemas.openxmlformats.org/markup-compatibility/2006" xmlns:mv="urn:schemas-microsoft-com:mac:vml" xmlns:o="urn:schemas-microsoft-com:office:office" xmlns:r="http://schemas.openxmlformats.org/officeDocument/2006/relationships" xmlns:m="http://schemas.openxmlformats.org/officeDocument/2006/math" xmlns:v="urn:schemas-microsoft-com:vml" xmlns:wp14="http://schemas.microsoft.com/office/word/2010/wordprocessingDrawing" xmlns:wp="http://schemas.openxmlformats.org/drawingml/2006/wordprocessingDrawing" xmlns:w10="urn:schemas-microsoft-com:office:word" xmlns:w="http://schemas.openxmlformats.org/wordprocessingml/2006/main" xmlns:w14="http://schemas.microsoft.com/office/word/2010/wordml" xmlns:wpg="http://schemas.microsoft.com/office/word/2010/wordprocessingGroup" xmlns:wpi="http://schemas.microsoft.com/office/word/2010/wordprocessingInk" xmlns:wne="http://schemas.microsoft.com/office/word/2006/wordml" xmlns:wps="http://schemas.microsoft.com/office/word/2010/wordprocessingShape" mc:Ignorable="w14 wp14">
   <w:body>
+    <w:p>
+      <w:pPr>
+        <w:jc w:val="right"/>
+      </w:pPr>
+      <w:r>
+        <w:drawing>
+          <wp:inline xmlns:a="http://schemas.openxmlformats.org/drawingml/2006/main" xmlns:pic="http://schemas.openxmlformats.org/drawingml/2006/picture">
+            <wp:extent cx="792000" cy="737675"/>
+            <wp:docPr id="1" name="Picture 1"/>
+            <wp:cNvGraphicFramePr>
+              <a:graphicFrameLocks noChangeAspect="1"/>
+            </wp:cNvGraphicFramePr>
+            <a:graphic>
+              <a:graphicData uri="http://schemas.openxmlformats.org/drawingml/2006/picture">
+                <pic:pic>
+                  <pic:nvPicPr>
+                    <pic:cNvPr id="0" name="logo_tiet.png"/>
+                    <pic:cNvPicPr/>
+                  </pic:nvPicPr>
+                  <pic:blipFill>
+                    <a:blip r:embed="rId9"/>
+                    <a:stretch>
+                      <a:fillRect/>
+                    </a:stretch>
+                  </pic:blipFill>
+                  <pic:spPr>
+                    <a:xfrm>
+                      <a:off x="0" y="0"/>
+                      <a:ext cx="792000" cy="737675"/>
+                    </a:xfrm>
+                    <a:prstGeom prst="rect"/>
+                  </pic:spPr>
+                </pic:pic>
+              </a:graphicData>
+            </a:graphic>
+          </wp:inline>
+        </w:drawing>
+      </w:r>
+    </w:p>
+    <w:p>
+      <w:pPr>
+        <w:spacing w:after="1200"/>
+      </w:pPr>
+      <w:r>
+        <w:rPr>
+          <w:rFonts w:ascii="Arial" w:hAnsi="Arial"/>
+          <w:b/>
+          <w:i w:val="0"/>
+          <w:color w:val="1F5FA8"/>
+          <w:sz w:val="19"/>
+        </w:rPr>
+        <w:t>RESEARCH PAPER · VERSION 3</w:t>
+      </w:r>
+    </w:p>
+    <w:p>
+      <w:pPr>
+        <w:spacing w:after="200"/>
+      </w:pPr>
+      <w:r>
+        <w:rPr>
+          <w:rFonts w:ascii="Arial" w:hAnsi="Arial"/>
+          <w:b/>
+          <w:i w:val="0"/>
+          <w:color w:val="0F172A"/>
+          <w:sz w:val="48"/>
+        </w:rPr>
+        <w:t>Droplet Intelligence: physics-informed Gaussian-process prediction of maximum spreading on laser-textured surfaces never seen in training</w:t>
+      </w:r>
+    </w:p>
+    <w:p>
+      <w:pPr>
+        <w:spacing w:after="720"/>
+      </w:pPr>
+      <w:r>
+        <w:rPr>
+          <w:rFonts w:ascii="Arial" w:hAnsi="Arial"/>
+          <w:b w:val="0"/>
+          <w:i w:val="0"/>
+          <w:color w:val="5B6475"/>
+          <w:sz w:val="26"/>
+        </w:rPr>
+        <w:t>Dimensionless inputs, surface-held-out validation, calibrated uncertainty, and image and video measurement front ends</w:t>
+      </w:r>
+    </w:p>
+    <w:p>
+      <w:pPr>
+        <w:spacing w:after="40"/>
+      </w:pPr>
+      <w:r>
+        <w:rPr>
+          <w:rFonts w:ascii="Arial" w:hAnsi="Arial"/>
+          <w:b/>
+          <w:i w:val="0"/>
+          <w:sz w:val="28"/>
+        </w:rPr>
+        <w:t>Parth Sharma</w:t>
+      </w:r>
+    </w:p>
+    <w:p>
+      <w:pPr>
+        <w:spacing w:after="480"/>
+      </w:pPr>
+      <w:r>
+        <w:rPr>
+          <w:b w:val="0"/>
+          <w:i/>
+          <w:color w:val="5B6475"/>
+          <w:sz w:val="22"/>
+        </w:rPr>
+        <w:t>Thapar Institute of Engineering &amp; Technology, Patiala, India</w:t>
+      </w:r>
+    </w:p>
+    <w:p>
+      <w:r>
+        <w:drawing>
+          <wp:inline xmlns:a="http://schemas.openxmlformats.org/drawingml/2006/main" xmlns:pic="http://schemas.openxmlformats.org/drawingml/2006/picture">
+            <wp:extent cx="6120000" cy="2338484"/>
+            <wp:docPr id="2" name="Picture 2"/>
+            <wp:cNvGraphicFramePr>
+              <a:graphicFrameLocks noChangeAspect="1"/>
+            </wp:cNvGraphicFramePr>
+            <a:graphic>
+              <a:graphicData uri="http://schemas.openxmlformats.org/drawingml/2006/picture">
+                <pic:pic>
+                  <pic:nvPicPr>
+                    <pic:cNvPr id="0" name="fig04_parity.png"/>
+                    <pic:cNvPicPr/>
+                  </pic:nvPicPr>
+                  <pic:blipFill>
+                    <a:blip r:embed="rId10"/>
+                    <a:stretch>
+                      <a:fillRect/>
+                    </a:stretch>
+                  </pic:blipFill>
+                  <pic:spPr>
+                    <a:xfrm>
+                      <a:off x="0" y="0"/>
+                      <a:ext cx="6120000" cy="2338484"/>
+                    </a:xfrm>
+                    <a:prstGeom prst="rect"/>
+                  </pic:spPr>
+                </pic:pic>
+              </a:graphicData>
+            </a:graphic>
+          </wp:inline>
+        </w:drawing>
+      </w:r>
+    </w:p>
+    <w:p>
+      <w:pPr>
+        <w:spacing w:after="200"/>
+      </w:pPr>
+      <w:r>
+        <w:rPr>
+          <w:rFonts w:ascii="Arial" w:hAnsi="Arial"/>
+          <w:b w:val="0"/>
+          <w:i w:val="0"/>
+          <w:color w:val="1F5FA8"/>
+          <w:sz w:val="19"/>
+        </w:rPr>
+        <w:t>0.0400 RMSE on unseen surfaces   ·   0.991 R² on unseen surfaces   ·   1,623 drop impacts analysed   ·   90.1% coverage of 90% interval</w:t>
+      </w:r>
+    </w:p>
+    <w:p>
+      <w:pPr>
+        <w:spacing w:after="0"/>
+      </w:pPr>
+      <w:r>
+        <w:rPr>
+          <w:b w:val="0"/>
+          <w:i w:val="0"/>
+          <w:color w:val="5B6475"/>
+          <w:sz w:val="18"/>
+        </w:rPr>
+        <w:t>Prepared for Interfacial Phenomena in Droplets 2026, IISc Bengaluru, 5–7 October 2026   ·   Version 3 · 03 October 2026</w:t>
+      </w:r>
+      <w:r>
+        <w:br w:type="page"/>
+      </w:r>
+    </w:p>
     <w:p>
       <w:pPr>
         <w:spacing w:after="80"/>
@@ -63,7 +243,7 @@
           <w:color w:val="5B6475"/>
           <w:sz w:val="19"/>
         </w:rPr>
-        <w:t>Version 3 · 02 October 2026</w:t>
+        <w:t>Version 3 · 03 October 2026</w:t>
       </w:r>
     </w:p>
     <w:p>
@@ -942,7 +1122,7 @@
         <w:drawing>
           <wp:inline xmlns:a="http://schemas.openxmlformats.org/drawingml/2006/main" xmlns:pic="http://schemas.openxmlformats.org/drawingml/2006/picture">
             <wp:extent cx="6120000" cy="2708563"/>
-            <wp:docPr id="1" name="Picture 1"/>
+            <wp:docPr id="3" name="Picture 3"/>
             <wp:cNvGraphicFramePr>
               <a:graphicFrameLocks noChangeAspect="1"/>
             </wp:cNvGraphicFramePr>
@@ -954,7 +1134,7 @@
                     <pic:cNvPicPr/>
                   </pic:nvPicPr>
                   <pic:blipFill>
-                    <a:blip r:embed="rId9"/>
+                    <a:blip r:embed="rId11"/>
                     <a:stretch>
                       <a:fillRect/>
                     </a:stretch>
@@ -2855,7 +3035,7 @@
         <w:drawing>
           <wp:inline xmlns:a="http://schemas.openxmlformats.org/drawingml/2006/main" xmlns:pic="http://schemas.openxmlformats.org/drawingml/2006/picture">
             <wp:extent cx="6120000" cy="3204655"/>
-            <wp:docPr id="2" name="Picture 2"/>
+            <wp:docPr id="4" name="Picture 4"/>
             <wp:cNvGraphicFramePr>
               <a:graphicFrameLocks noChangeAspect="1"/>
             </wp:cNvGraphicFramePr>
@@ -2867,7 +3047,7 @@
                     <pic:cNvPicPr/>
                   </pic:nvPicPr>
                   <pic:blipFill>
-                    <a:blip r:embed="rId10"/>
+                    <a:blip r:embed="rId12"/>
                     <a:stretch>
                       <a:fillRect/>
                     </a:stretch>
@@ -9044,7 +9224,7 @@
         <w:drawing>
           <wp:inline xmlns:a="http://schemas.openxmlformats.org/drawingml/2006/main" xmlns:pic="http://schemas.openxmlformats.org/drawingml/2006/picture">
             <wp:extent cx="6120000" cy="3391320"/>
-            <wp:docPr id="3" name="Picture 3"/>
+            <wp:docPr id="5" name="Picture 5"/>
             <wp:cNvGraphicFramePr>
               <a:graphicFrameLocks noChangeAspect="1"/>
             </wp:cNvGraphicFramePr>
@@ -9056,7 +9236,7 @@
                     <pic:cNvPicPr/>
                   </pic:nvPicPr>
                   <pic:blipFill>
-                    <a:blip r:embed="rId11"/>
+                    <a:blip r:embed="rId13"/>
                     <a:stretch>
                       <a:fillRect/>
                     </a:stretch>
@@ -9117,7 +9297,7 @@
         <w:drawing>
           <wp:inline xmlns:a="http://schemas.openxmlformats.org/drawingml/2006/main" xmlns:pic="http://schemas.openxmlformats.org/drawingml/2006/picture">
             <wp:extent cx="6120000" cy="2338484"/>
-            <wp:docPr id="4" name="Picture 4"/>
+            <wp:docPr id="6" name="Picture 6"/>
             <wp:cNvGraphicFramePr>
               <a:graphicFrameLocks noChangeAspect="1"/>
             </wp:cNvGraphicFramePr>
@@ -9129,7 +9309,7 @@
                     <pic:cNvPicPr/>
                   </pic:nvPicPr>
                   <pic:blipFill>
-                    <a:blip r:embed="rId12"/>
+                    <a:blip r:embed="rId10"/>
                     <a:stretch>
                       <a:fillRect/>
                     </a:stretch>
@@ -11010,7 +11190,7 @@
         <w:drawing>
           <wp:inline xmlns:a="http://schemas.openxmlformats.org/drawingml/2006/main" xmlns:pic="http://schemas.openxmlformats.org/drawingml/2006/picture">
             <wp:extent cx="6120000" cy="2795088"/>
-            <wp:docPr id="5" name="Picture 5"/>
+            <wp:docPr id="7" name="Picture 7"/>
             <wp:cNvGraphicFramePr>
               <a:graphicFrameLocks noChangeAspect="1"/>
             </wp:cNvGraphicFramePr>
@@ -11022,7 +11202,7 @@
                     <pic:cNvPicPr/>
                   </pic:nvPicPr>
                   <pic:blipFill>
-                    <a:blip r:embed="rId13"/>
+                    <a:blip r:embed="rId14"/>
                     <a:stretch>
                       <a:fillRect/>
                     </a:stretch>
@@ -11064,7 +11244,7 @@
         <w:drawing>
           <wp:inline xmlns:a="http://schemas.openxmlformats.org/drawingml/2006/main" xmlns:pic="http://schemas.openxmlformats.org/drawingml/2006/picture">
             <wp:extent cx="6120000" cy="2181113"/>
-            <wp:docPr id="6" name="Picture 6"/>
+            <wp:docPr id="8" name="Picture 8"/>
             <wp:cNvGraphicFramePr>
               <a:graphicFrameLocks noChangeAspect="1"/>
             </wp:cNvGraphicFramePr>
@@ -11076,7 +11256,7 @@
                     <pic:cNvPicPr/>
                   </pic:nvPicPr>
                   <pic:blipFill>
-                    <a:blip r:embed="rId14"/>
+                    <a:blip r:embed="rId15"/>
                     <a:stretch>
                       <a:fillRect/>
                     </a:stretch>
@@ -11214,7 +11394,7 @@
         <w:drawing>
           <wp:inline xmlns:a="http://schemas.openxmlformats.org/drawingml/2006/main" xmlns:pic="http://schemas.openxmlformats.org/drawingml/2006/picture">
             <wp:extent cx="6120000" cy="2505586"/>
-            <wp:docPr id="7" name="Picture 7"/>
+            <wp:docPr id="9" name="Picture 9"/>
             <wp:cNvGraphicFramePr>
               <a:graphicFrameLocks noChangeAspect="1"/>
             </wp:cNvGraphicFramePr>
@@ -11226,7 +11406,7 @@
                     <pic:cNvPicPr/>
                   </pic:nvPicPr>
                   <pic:blipFill>
-                    <a:blip r:embed="rId15"/>
+                    <a:blip r:embed="rId16"/>
                     <a:stretch>
                       <a:fillRect/>
                     </a:stretch>
@@ -11309,7 +11489,7 @@
         <w:drawing>
           <wp:inline xmlns:a="http://schemas.openxmlformats.org/drawingml/2006/main" xmlns:pic="http://schemas.openxmlformats.org/drawingml/2006/picture">
             <wp:extent cx="6120000" cy="2576154"/>
-            <wp:docPr id="8" name="Picture 8"/>
+            <wp:docPr id="10" name="Picture 10"/>
             <wp:cNvGraphicFramePr>
               <a:graphicFrameLocks noChangeAspect="1"/>
             </wp:cNvGraphicFramePr>
@@ -11321,7 +11501,7 @@
                     <pic:cNvPicPr/>
                   </pic:nvPicPr>
                   <pic:blipFill>
-                    <a:blip r:embed="rId16"/>
+                    <a:blip r:embed="rId17"/>
                     <a:stretch>
                       <a:fillRect/>
                     </a:stretch>
@@ -11363,7 +11543,7 @@
         <w:drawing>
           <wp:inline xmlns:a="http://schemas.openxmlformats.org/drawingml/2006/main" xmlns:pic="http://schemas.openxmlformats.org/drawingml/2006/picture">
             <wp:extent cx="6120000" cy="2869243"/>
-            <wp:docPr id="9" name="Picture 9"/>
+            <wp:docPr id="11" name="Picture 11"/>
             <wp:cNvGraphicFramePr>
               <a:graphicFrameLocks noChangeAspect="1"/>
             </wp:cNvGraphicFramePr>
@@ -11375,7 +11555,7 @@
                     <pic:cNvPicPr/>
                   </pic:nvPicPr>
                   <pic:blipFill>
-                    <a:blip r:embed="rId17"/>
+                    <a:blip r:embed="rId18"/>
                     <a:stretch>
                       <a:fillRect/>
                     </a:stretch>
@@ -11556,7 +11736,7 @@
         <w:drawing>
           <wp:inline xmlns:a="http://schemas.openxmlformats.org/drawingml/2006/main" xmlns:pic="http://schemas.openxmlformats.org/drawingml/2006/picture">
             <wp:extent cx="6120000" cy="2669545"/>
-            <wp:docPr id="10" name="Picture 10"/>
+            <wp:docPr id="12" name="Picture 12"/>
             <wp:cNvGraphicFramePr>
               <a:graphicFrameLocks noChangeAspect="1"/>
             </wp:cNvGraphicFramePr>
@@ -11568,7 +11748,7 @@
                     <pic:cNvPicPr/>
                   </pic:nvPicPr>
                   <pic:blipFill>
-                    <a:blip r:embed="rId18"/>
+                    <a:blip r:embed="rId19"/>
                     <a:stretch>
                       <a:fillRect/>
                     </a:stretch>
@@ -11816,7 +11996,7 @@
         <w:drawing>
           <wp:inline xmlns:a="http://schemas.openxmlformats.org/drawingml/2006/main" xmlns:pic="http://schemas.openxmlformats.org/drawingml/2006/picture">
             <wp:extent cx="6120000" cy="3157808"/>
-            <wp:docPr id="11" name="Picture 11"/>
+            <wp:docPr id="13" name="Picture 13"/>
             <wp:cNvGraphicFramePr>
               <a:graphicFrameLocks noChangeAspect="1"/>
             </wp:cNvGraphicFramePr>
@@ -11828,7 +12008,7 @@
                     <pic:cNvPicPr/>
                   </pic:nvPicPr>
                   <pic:blipFill>
-                    <a:blip r:embed="rId19"/>
+                    <a:blip r:embed="rId20"/>
                     <a:stretch>
                       <a:fillRect/>
                     </a:stretch>
@@ -12330,7 +12510,7 @@
         <w:drawing>
           <wp:inline xmlns:a="http://schemas.openxmlformats.org/drawingml/2006/main" xmlns:pic="http://schemas.openxmlformats.org/drawingml/2006/picture">
             <wp:extent cx="6120000" cy="1782524"/>
-            <wp:docPr id="12" name="Picture 12"/>
+            <wp:docPr id="14" name="Picture 14"/>
             <wp:cNvGraphicFramePr>
               <a:graphicFrameLocks noChangeAspect="1"/>
             </wp:cNvGraphicFramePr>
@@ -12342,7 +12522,7 @@
                     <pic:cNvPicPr/>
                   </pic:nvPicPr>
                   <pic:blipFill>
-                    <a:blip r:embed="rId20"/>
+                    <a:blip r:embed="rId21"/>
                     <a:stretch>
                       <a:fillRect/>
                     </a:stretch>

</xml_diff>

<commit_message>
Paper: professional cover, contents page, abstract page; introduction starts at page 1; no version or date
</commit_message>
<xml_diff>
--- a/paper/v3/Droplet_Intelligence_Paper_v3.docx
+++ b/paper/v3/Droplet_Intelligence_Paper_v3.docx
@@ -4,12 +4,12 @@
   <w:body>
     <w:p>
       <w:pPr>
-        <w:jc w:val="right"/>
+        <w:jc w:val="center"/>
       </w:pPr>
       <w:r>
         <w:drawing>
           <wp:inline xmlns:a="http://schemas.openxmlformats.org/drawingml/2006/main" xmlns:pic="http://schemas.openxmlformats.org/drawingml/2006/picture">
-            <wp:extent cx="792000" cy="737675"/>
+            <wp:extent cx="936000" cy="871798"/>
             <wp:docPr id="1" name="Picture 1"/>
             <wp:cNvGraphicFramePr>
               <a:graphicFrameLocks noChangeAspect="1"/>
@@ -30,7 +30,7 @@
                   <pic:spPr>
                     <a:xfrm>
                       <a:off x="0" y="0"/>
-                      <a:ext cx="792000" cy="737675"/>
+                      <a:ext cx="936000" cy="871798"/>
                     </a:xfrm>
                     <a:prstGeom prst="rect"/>
                   </pic:spPr>
@@ -44,46 +44,152 @@
     <w:p>
       <w:pPr>
         <w:spacing w:after="1200"/>
+        <w:jc w:val="center"/>
+      </w:pPr>
+      <w:r>
+        <w:rPr>
+          <w:b w:val="0"/>
+          <w:i w:val="0"/>
+          <w:sz w:val="24"/>
+        </w:rPr>
+        <w:t>Thapar Institute of Engineering &amp; Technology, Patiala</w:t>
+      </w:r>
+    </w:p>
+    <w:p>
+      <w:pPr>
+        <w:spacing w:after="200"/>
+        <w:jc w:val="center"/>
       </w:pPr>
       <w:r>
         <w:rPr>
           <w:rFonts w:ascii="Arial" w:hAnsi="Arial"/>
           <w:b/>
           <w:i w:val="0"/>
-          <w:color w:val="1F5FA8"/>
-          <w:sz w:val="19"/>
+          <w:color w:val="1F3A68"/>
+          <w:sz w:val="21"/>
         </w:rPr>
-        <w:t>RESEARCH PAPER · VERSION 3</w:t>
+        <w:t>RESEARCH PAPER</w:t>
       </w:r>
     </w:p>
     <w:p>
       <w:pPr>
-        <w:spacing w:after="200"/>
+        <w:spacing w:after="360"/>
+        <w:jc w:val="center"/>
       </w:pPr>
       <w:r>
         <w:rPr>
           <w:rFonts w:ascii="Arial" w:hAnsi="Arial"/>
           <w:b/>
           <w:i w:val="0"/>
-          <w:color w:val="0F172A"/>
-          <w:sz w:val="48"/>
+          <w:color w:val="1F3A68"/>
+          <w:sz w:val="64"/>
         </w:rPr>
-        <w:t>Droplet Intelligence: physics-informed Gaussian-process prediction of maximum spreading on laser-textured surfaces never seen in training</w:t>
+        <w:t>Droplet Intelligence</w:t>
       </w:r>
     </w:p>
     <w:p>
       <w:pPr>
-        <w:spacing w:after="720"/>
+        <w:spacing w:after="200"/>
+        <w:jc w:val="center"/>
+      </w:pPr>
+      <w:r>
+        <w:rPr>
+          <w:b/>
+          <w:i w:val="0"/>
+          <w:sz w:val="34"/>
+        </w:rPr>
+        <w:t>Physics-informed Gaussian-process prediction of maximum spreading on laser-textured surfaces never seen in training</w:t>
+      </w:r>
+    </w:p>
+    <w:p>
+      <w:pPr>
+        <w:spacing w:after="2200"/>
+        <w:jc w:val="center"/>
+      </w:pPr>
+      <w:r>
+        <w:rPr>
+          <w:b w:val="0"/>
+          <w:i/>
+          <w:color w:val="333333"/>
+          <w:sz w:val="25"/>
+        </w:rPr>
+        <w:t>Dimensionless inputs, surface-held-out validation, calibrated uncertainty, and image and video measurement front ends</w:t>
+      </w:r>
+    </w:p>
+    <w:p>
+      <w:pPr>
+        <w:spacing w:after="80"/>
+        <w:jc w:val="center"/>
+      </w:pPr>
+      <w:r>
+        <w:rPr>
+          <w:b w:val="0"/>
+          <w:i w:val="0"/>
+          <w:color w:val="444444"/>
+          <w:sz w:val="22"/>
+        </w:rPr>
+        <w:t>SUBMITTED BY</w:t>
+      </w:r>
+    </w:p>
+    <w:p>
+      <w:pPr>
+        <w:spacing w:after="40"/>
+        <w:jc w:val="center"/>
+      </w:pPr>
+      <w:r>
+        <w:rPr>
+          <w:b/>
+          <w:i w:val="0"/>
+          <w:sz w:val="40"/>
+        </w:rPr>
+        <w:t>Parth Sharma</w:t>
+      </w:r>
+    </w:p>
+    <w:p>
+      <w:pPr>
+        <w:spacing w:after="800"/>
+        <w:jc w:val="center"/>
+      </w:pPr>
+      <w:r>
+        <w:rPr>
+          <w:b w:val="0"/>
+          <w:i w:val="0"/>
+          <w:sz w:val="24"/>
+        </w:rPr>
+        <w:t>Thapar Institute of Engineering &amp; Technology, Patiala, India</w:t>
+      </w:r>
+    </w:p>
+    <w:p>
+      <w:pPr>
+        <w:spacing w:after="0"/>
+        <w:jc w:val="center"/>
+      </w:pPr>
+      <w:r>
+        <w:rPr>
+          <w:b w:val="0"/>
+          <w:i w:val="0"/>
+          <w:color w:val="333333"/>
+          <w:sz w:val="21"/>
+        </w:rPr>
+        <w:t>Prepared for Interfacial Phenomena in Droplets 2026, IISc Bengaluru, 5–7 October 2026</w:t>
+      </w:r>
+      <w:r>
+        <w:br w:type="page"/>
+      </w:r>
+    </w:p>
+    <w:p>
+      <w:pPr>
+        <w:spacing w:after="240"/>
       </w:pPr>
       <w:r>
         <w:rPr>
           <w:rFonts w:ascii="Arial" w:hAnsi="Arial"/>
-          <w:b w:val="0"/>
+          <w:b/>
           <w:i w:val="0"/>
-          <w:color w:val="5B6475"/>
-          <w:sz w:val="26"/>
+          <w:color w:val="1F3A68"/>
+          <w:sz w:val="36"/>
         </w:rPr>
-        <w:t>Dimensionless inputs, surface-held-out validation, calibrated uncertainty, and image and video measurement front ends</w:t>
+        <w:t>CONTENTS</w:t>
       </w:r>
     </w:p>
     <w:p>
@@ -92,91 +198,368 @@
       </w:pPr>
       <w:r>
         <w:rPr>
-          <w:rFonts w:ascii="Arial" w:hAnsi="Arial"/>
           <w:b/>
           <w:i w:val="0"/>
-          <w:sz w:val="28"/>
+          <w:sz w:val="22"/>
         </w:rPr>
-        <w:t>Parth Sharma</w:t>
+        <w:t>1. Introduction</w:t>
       </w:r>
     </w:p>
     <w:p>
       <w:pPr>
-        <w:spacing w:after="480"/>
+        <w:spacing w:after="40"/>
       </w:pPr>
       <w:r>
         <w:rPr>
-          <w:b w:val="0"/>
-          <w:i/>
-          <w:color w:val="5B6475"/>
+          <w:b/>
+          <w:i w:val="0"/>
           <w:sz w:val="22"/>
         </w:rPr>
-        <w:t>Thapar Institute of Engineering &amp; Technology, Patiala, India</w:t>
-      </w:r>
-    </w:p>
-    <w:p>
-      <w:r>
-        <w:drawing>
-          <wp:inline xmlns:a="http://schemas.openxmlformats.org/drawingml/2006/main" xmlns:pic="http://schemas.openxmlformats.org/drawingml/2006/picture">
-            <wp:extent cx="6120000" cy="2338484"/>
-            <wp:docPr id="2" name="Picture 2"/>
-            <wp:cNvGraphicFramePr>
-              <a:graphicFrameLocks noChangeAspect="1"/>
-            </wp:cNvGraphicFramePr>
-            <a:graphic>
-              <a:graphicData uri="http://schemas.openxmlformats.org/drawingml/2006/picture">
-                <pic:pic>
-                  <pic:nvPicPr>
-                    <pic:cNvPr id="0" name="fig04_parity.png"/>
-                    <pic:cNvPicPr/>
-                  </pic:nvPicPr>
-                  <pic:blipFill>
-                    <a:blip r:embed="rId10"/>
-                    <a:stretch>
-                      <a:fillRect/>
-                    </a:stretch>
-                  </pic:blipFill>
-                  <pic:spPr>
-                    <a:xfrm>
-                      <a:off x="0" y="0"/>
-                      <a:ext cx="6120000" cy="2338484"/>
-                    </a:xfrm>
-                    <a:prstGeom prst="rect"/>
-                  </pic:spPr>
-                </pic:pic>
-              </a:graphicData>
-            </a:graphic>
-          </wp:inline>
-        </w:drawing>
+        <w:t>2. Physical background</w:t>
       </w:r>
     </w:p>
     <w:p>
       <w:pPr>
-        <w:spacing w:after="200"/>
+        <w:spacing w:after="40"/>
       </w:pPr>
       <w:r>
         <w:rPr>
-          <w:rFonts w:ascii="Arial" w:hAnsi="Arial"/>
-          <w:b w:val="0"/>
+          <w:b/>
           <w:i w:val="0"/>
-          <w:color w:val="1F5FA8"/>
-          <w:sz w:val="19"/>
+          <w:sz w:val="22"/>
         </w:rPr>
-        <w:t>0.0400 RMSE on unseen surfaces   ·   0.991 R² on unseen surfaces   ·   1,623 drop impacts analysed   ·   90.1% coverage of 90% interval</w:t>
+        <w:t>3. Dataset</w:t>
       </w:r>
     </w:p>
     <w:p>
       <w:pPr>
-        <w:spacing w:after="0"/>
+        <w:spacing w:after="40"/>
+      </w:pPr>
+      <w:r>
+        <w:rPr>
+          <w:b/>
+          <w:i w:val="0"/>
+          <w:sz w:val="22"/>
+        </w:rPr>
+        <w:t>4. Preprocessing and surface descriptors</w:t>
+      </w:r>
+    </w:p>
+    <w:p>
+      <w:pPr>
+        <w:spacing w:after="40"/>
+      </w:pPr>
+      <w:r>
+        <w:rPr>
+          <w:b/>
+          <w:i w:val="0"/>
+          <w:sz w:val="22"/>
+        </w:rPr>
+        <w:t>5. Evaluation protocol, leakage control and statistics</w:t>
+      </w:r>
+    </w:p>
+    <w:p>
+      <w:pPr>
+        <w:spacing w:after="40"/>
+        <w:ind w:left="454"/>
       </w:pPr>
       <w:r>
         <w:rPr>
           <w:b w:val="0"/>
           <w:i w:val="0"/>
-          <w:color w:val="5B6475"/>
-          <w:sz w:val="18"/>
+          <w:sz w:val="20"/>
         </w:rPr>
-        <w:t>Prepared for Interfacial Phenomena in Droplets 2026, IISc Bengaluru, 5–7 October 2026   ·   Version 3 · 03 October 2026</w:t>
+        <w:t>5.1 Three test settings</w:t>
+      </w:r>
+    </w:p>
+    <w:p>
+      <w:pPr>
+        <w:spacing w:after="40"/>
+        <w:ind w:left="454"/>
+      </w:pPr>
+      <w:r>
+        <w:rPr>
+          <w:b w:val="0"/>
+          <w:i w:val="0"/>
+          <w:sz w:val="20"/>
+        </w:rPr>
+        <w:t>5.2 Leakage checks</w:t>
+      </w:r>
+    </w:p>
+    <w:p>
+      <w:pPr>
+        <w:spacing w:after="40"/>
+        <w:ind w:left="454"/>
+      </w:pPr>
+      <w:r>
+        <w:rPr>
+          <w:b w:val="0"/>
+          <w:i w:val="0"/>
+          <w:sz w:val="20"/>
+        </w:rPr>
+        <w:t>5.3 Metrics</w:t>
+      </w:r>
+    </w:p>
+    <w:p>
+      <w:pPr>
+        <w:spacing w:after="40"/>
+        <w:ind w:left="454"/>
+      </w:pPr>
+      <w:r>
+        <w:rPr>
+          <w:b w:val="0"/>
+          <w:i w:val="0"/>
+          <w:sz w:val="20"/>
+        </w:rPr>
+        <w:t>5.4 Statistical comparison</w:t>
+      </w:r>
+    </w:p>
+    <w:p>
+      <w:pPr>
+        <w:spacing w:after="40"/>
+      </w:pPr>
+      <w:r>
+        <w:rPr>
+          <w:b/>
+          <w:i w:val="0"/>
+          <w:sz w:val="22"/>
+        </w:rPr>
+        <w:t>6. Models and hyperparameters</w:t>
+      </w:r>
+    </w:p>
+    <w:p>
+      <w:pPr>
+        <w:spacing w:after="40"/>
+      </w:pPr>
+      <w:r>
+        <w:rPr>
+          <w:b/>
+          <w:i w:val="0"/>
+          <w:sz w:val="22"/>
+        </w:rPr>
+        <w:t>7. Results: surface-held-out benchmark</w:t>
+      </w:r>
+    </w:p>
+    <w:p>
+      <w:pPr>
+        <w:spacing w:after="40"/>
+      </w:pPr>
+      <w:r>
+        <w:rPr>
+          <w:b/>
+          <w:i w:val="0"/>
+          <w:sz w:val="22"/>
+        </w:rPr>
+        <w:t>8. Why the models differ</w:t>
+      </w:r>
+    </w:p>
+    <w:p>
+      <w:pPr>
+        <w:spacing w:after="40"/>
+      </w:pPr>
+      <w:r>
+        <w:rPr>
+          <w:b/>
+          <w:i w:val="0"/>
+          <w:sz w:val="22"/>
+        </w:rPr>
+        <w:t>9. Ablation of input representations</w:t>
+      </w:r>
+    </w:p>
+    <w:p>
+      <w:pPr>
+        <w:spacing w:after="40"/>
+      </w:pPr>
+      <w:r>
+        <w:rPr>
+          <w:b/>
+          <w:i w:val="0"/>
+          <w:sz w:val="22"/>
+        </w:rPr>
+        <w:t>10. Uncertainty and error analysis</w:t>
+      </w:r>
+    </w:p>
+    <w:p>
+      <w:pPr>
+        <w:spacing w:after="40"/>
+        <w:ind w:left="454"/>
+      </w:pPr>
+      <w:r>
+        <w:rPr>
+          <w:b w:val="0"/>
+          <w:i w:val="0"/>
+          <w:sz w:val="20"/>
+        </w:rPr>
+        <w:t>10.1 Error structure</w:t>
+      </w:r>
+    </w:p>
+    <w:p>
+      <w:pPr>
+        <w:spacing w:after="40"/>
+        <w:ind w:left="454"/>
+      </w:pPr>
+      <w:r>
+        <w:rPr>
+          <w:b w:val="0"/>
+          <w:i w:val="0"/>
+          <w:sz w:val="20"/>
+        </w:rPr>
+        <w:t>10.2 Calibrated intervals</w:t>
+      </w:r>
+    </w:p>
+    <w:p>
+      <w:pPr>
+        <w:spacing w:after="40"/>
+      </w:pPr>
+      <w:r>
+        <w:rPr>
+          <w:b/>
+          <w:i w:val="0"/>
+          <w:sz w:val="22"/>
+        </w:rPr>
+        <w:t>11. Image-based surface description</w:t>
+      </w:r>
+    </w:p>
+    <w:p>
+      <w:pPr>
+        <w:spacing w:after="40"/>
+      </w:pPr>
+      <w:r>
+        <w:rPr>
+          <w:b/>
+          <w:i w:val="0"/>
+          <w:sz w:val="22"/>
+        </w:rPr>
+        <w:t>12. Measurement from side-view video</w:t>
+      </w:r>
+    </w:p>
+    <w:p>
+      <w:pPr>
+        <w:spacing w:after="40"/>
+      </w:pPr>
+      <w:r>
+        <w:rPr>
+          <w:b/>
+          <w:i w:val="0"/>
+          <w:sz w:val="22"/>
+        </w:rPr>
+        <w:t>13. Real-time Droplet Intelligence platform</w:t>
+      </w:r>
+    </w:p>
+    <w:p>
+      <w:pPr>
+        <w:spacing w:after="40"/>
+      </w:pPr>
+      <w:r>
+        <w:rPr>
+          <w:b/>
+          <w:i w:val="0"/>
+          <w:sz w:val="22"/>
+        </w:rPr>
+        <w:t>14. Discussion</w:t>
+      </w:r>
+    </w:p>
+    <w:p>
+      <w:pPr>
+        <w:spacing w:after="40"/>
+      </w:pPr>
+      <w:r>
+        <w:rPr>
+          <w:b/>
+          <w:i w:val="0"/>
+          <w:sz w:val="22"/>
+        </w:rPr>
+        <w:t>15. Limitations</w:t>
+      </w:r>
+    </w:p>
+    <w:p>
+      <w:pPr>
+        <w:spacing w:after="40"/>
+      </w:pPr>
+      <w:r>
+        <w:rPr>
+          <w:b/>
+          <w:i w:val="0"/>
+          <w:sz w:val="22"/>
+        </w:rPr>
+        <w:t>16. Conclusions and future work</w:t>
+      </w:r>
+    </w:p>
+    <w:p>
+      <w:pPr>
+        <w:spacing w:after="40"/>
+      </w:pPr>
+      <w:r>
+        <w:rPr>
+          <w:b/>
+          <w:i w:val="0"/>
+          <w:sz w:val="22"/>
+        </w:rPr>
+        <w:t>Acknowledgements</w:t>
+      </w:r>
+    </w:p>
+    <w:p>
+      <w:pPr>
+        <w:spacing w:after="40"/>
+      </w:pPr>
+      <w:r>
+        <w:rPr>
+          <w:b/>
+          <w:i w:val="0"/>
+          <w:sz w:val="22"/>
+        </w:rPr>
+        <w:t>Data and code availability</w:t>
+      </w:r>
+    </w:p>
+    <w:p>
+      <w:pPr>
+        <w:spacing w:after="40"/>
+      </w:pPr>
+      <w:r>
+        <w:rPr>
+          <w:b/>
+          <w:i w:val="0"/>
+          <w:sz w:val="22"/>
+        </w:rPr>
+        <w:t>References</w:t>
+      </w:r>
+    </w:p>
+    <w:p>
+      <w:pPr>
+        <w:spacing w:after="40"/>
+      </w:pPr>
+      <w:r>
+        <w:rPr>
+          <w:b/>
+          <w:i w:val="0"/>
+          <w:sz w:val="22"/>
+        </w:rPr>
+        <w:t>Appendix A. Per-surface LOSO RMSE</w:t>
+      </w:r>
+    </w:p>
+    <w:p>
+      <w:pPr>
+        <w:spacing w:after="40"/>
+      </w:pPr>
+      <w:r>
+        <w:rPr>
+          <w:b/>
+          <w:i w:val="0"/>
+          <w:sz w:val="22"/>
+        </w:rPr>
+        <w:t>Appendix B. Reproducibility</w:t>
+      </w:r>
+    </w:p>
+    <w:p>
+      <w:pPr>
+        <w:spacing w:after="40"/>
+      </w:pPr>
+      <w:r>
+        <w:rPr>
+          <w:b/>
+          <w:i w:val="0"/>
+          <w:sz w:val="22"/>
+        </w:rPr>
+        <w:t>Appendix C. Verification report</w:t>
       </w:r>
       <w:r>
         <w:br w:type="page"/>
@@ -213,7 +596,7 @@
     </w:p>
     <w:p>
       <w:pPr>
-        <w:spacing w:after="0"/>
+        <w:spacing w:after="200"/>
       </w:pPr>
       <w:r>
         <w:rPr>
@@ -230,20 +613,6 @@
           <w:sz w:val="20"/>
         </w:rPr>
         <w:t xml:space="preserve"> · Thapar Institute of Engineering &amp; Technology, Patiala, India</w:t>
-      </w:r>
-    </w:p>
-    <w:p>
-      <w:pPr>
-        <w:spacing w:after="200"/>
-      </w:pPr>
-      <w:r>
-        <w:rPr>
-          <w:b w:val="0"/>
-          <w:i w:val="0"/>
-          <w:color w:val="5B6475"/>
-          <w:sz w:val="19"/>
-        </w:rPr>
-        <w:t>Version 3 · 03 October 2026</w:t>
       </w:r>
     </w:p>
     <w:p>
@@ -413,6 +782,9 @@
         </w:rPr>
         <w:t xml:space="preserve"> drop impact; maximum spreading; laser-textured superhydrophobic surfaces; Gaussian process regression; dimensionless analysis; leave-one-surface-out validation; uncertainty calibration; SEM image analysis; high-speed video</w:t>
       </w:r>
+      <w:r>
+        <w:br w:type="page"/>
+      </w:r>
     </w:p>
     <w:p>
       <w:pPr>
@@ -1122,7 +1494,7 @@
         <w:drawing>
           <wp:inline xmlns:a="http://schemas.openxmlformats.org/drawingml/2006/main" xmlns:pic="http://schemas.openxmlformats.org/drawingml/2006/picture">
             <wp:extent cx="6120000" cy="2708563"/>
-            <wp:docPr id="3" name="Picture 3"/>
+            <wp:docPr id="2" name="Picture 2"/>
             <wp:cNvGraphicFramePr>
               <a:graphicFrameLocks noChangeAspect="1"/>
             </wp:cNvGraphicFramePr>
@@ -1134,7 +1506,7 @@
                     <pic:cNvPicPr/>
                   </pic:nvPicPr>
                   <pic:blipFill>
-                    <a:blip r:embed="rId11"/>
+                    <a:blip r:embed="rId10"/>
                     <a:stretch>
                       <a:fillRect/>
                     </a:stretch>
@@ -3035,7 +3407,7 @@
         <w:drawing>
           <wp:inline xmlns:a="http://schemas.openxmlformats.org/drawingml/2006/main" xmlns:pic="http://schemas.openxmlformats.org/drawingml/2006/picture">
             <wp:extent cx="6120000" cy="3204655"/>
-            <wp:docPr id="4" name="Picture 4"/>
+            <wp:docPr id="3" name="Picture 3"/>
             <wp:cNvGraphicFramePr>
               <a:graphicFrameLocks noChangeAspect="1"/>
             </wp:cNvGraphicFramePr>
@@ -3047,7 +3419,7 @@
                     <pic:cNvPicPr/>
                   </pic:nvPicPr>
                   <pic:blipFill>
-                    <a:blip r:embed="rId12"/>
+                    <a:blip r:embed="rId11"/>
                     <a:stretch>
                       <a:fillRect/>
                     </a:stretch>
@@ -9224,7 +9596,7 @@
         <w:drawing>
           <wp:inline xmlns:a="http://schemas.openxmlformats.org/drawingml/2006/main" xmlns:pic="http://schemas.openxmlformats.org/drawingml/2006/picture">
             <wp:extent cx="6120000" cy="3391320"/>
-            <wp:docPr id="5" name="Picture 5"/>
+            <wp:docPr id="4" name="Picture 4"/>
             <wp:cNvGraphicFramePr>
               <a:graphicFrameLocks noChangeAspect="1"/>
             </wp:cNvGraphicFramePr>
@@ -9236,7 +9608,7 @@
                     <pic:cNvPicPr/>
                   </pic:nvPicPr>
                   <pic:blipFill>
-                    <a:blip r:embed="rId13"/>
+                    <a:blip r:embed="rId12"/>
                     <a:stretch>
                       <a:fillRect/>
                     </a:stretch>
@@ -9297,7 +9669,7 @@
         <w:drawing>
           <wp:inline xmlns:a="http://schemas.openxmlformats.org/drawingml/2006/main" xmlns:pic="http://schemas.openxmlformats.org/drawingml/2006/picture">
             <wp:extent cx="6120000" cy="2338484"/>
-            <wp:docPr id="6" name="Picture 6"/>
+            <wp:docPr id="5" name="Picture 5"/>
             <wp:cNvGraphicFramePr>
               <a:graphicFrameLocks noChangeAspect="1"/>
             </wp:cNvGraphicFramePr>
@@ -9309,7 +9681,7 @@
                     <pic:cNvPicPr/>
                   </pic:nvPicPr>
                   <pic:blipFill>
-                    <a:blip r:embed="rId10"/>
+                    <a:blip r:embed="rId13"/>
                     <a:stretch>
                       <a:fillRect/>
                     </a:stretch>
@@ -11190,7 +11562,7 @@
         <w:drawing>
           <wp:inline xmlns:a="http://schemas.openxmlformats.org/drawingml/2006/main" xmlns:pic="http://schemas.openxmlformats.org/drawingml/2006/picture">
             <wp:extent cx="6120000" cy="2795088"/>
-            <wp:docPr id="7" name="Picture 7"/>
+            <wp:docPr id="6" name="Picture 6"/>
             <wp:cNvGraphicFramePr>
               <a:graphicFrameLocks noChangeAspect="1"/>
             </wp:cNvGraphicFramePr>
@@ -11244,7 +11616,7 @@
         <w:drawing>
           <wp:inline xmlns:a="http://schemas.openxmlformats.org/drawingml/2006/main" xmlns:pic="http://schemas.openxmlformats.org/drawingml/2006/picture">
             <wp:extent cx="6120000" cy="2181113"/>
-            <wp:docPr id="8" name="Picture 8"/>
+            <wp:docPr id="7" name="Picture 7"/>
             <wp:cNvGraphicFramePr>
               <a:graphicFrameLocks noChangeAspect="1"/>
             </wp:cNvGraphicFramePr>
@@ -11394,7 +11766,7 @@
         <w:drawing>
           <wp:inline xmlns:a="http://schemas.openxmlformats.org/drawingml/2006/main" xmlns:pic="http://schemas.openxmlformats.org/drawingml/2006/picture">
             <wp:extent cx="6120000" cy="2505586"/>
-            <wp:docPr id="9" name="Picture 9"/>
+            <wp:docPr id="8" name="Picture 8"/>
             <wp:cNvGraphicFramePr>
               <a:graphicFrameLocks noChangeAspect="1"/>
             </wp:cNvGraphicFramePr>
@@ -11489,7 +11861,7 @@
         <w:drawing>
           <wp:inline xmlns:a="http://schemas.openxmlformats.org/drawingml/2006/main" xmlns:pic="http://schemas.openxmlformats.org/drawingml/2006/picture">
             <wp:extent cx="6120000" cy="2576154"/>
-            <wp:docPr id="10" name="Picture 10"/>
+            <wp:docPr id="9" name="Picture 9"/>
             <wp:cNvGraphicFramePr>
               <a:graphicFrameLocks noChangeAspect="1"/>
             </wp:cNvGraphicFramePr>
@@ -11543,7 +11915,7 @@
         <w:drawing>
           <wp:inline xmlns:a="http://schemas.openxmlformats.org/drawingml/2006/main" xmlns:pic="http://schemas.openxmlformats.org/drawingml/2006/picture">
             <wp:extent cx="6120000" cy="2869243"/>
-            <wp:docPr id="11" name="Picture 11"/>
+            <wp:docPr id="10" name="Picture 10"/>
             <wp:cNvGraphicFramePr>
               <a:graphicFrameLocks noChangeAspect="1"/>
             </wp:cNvGraphicFramePr>
@@ -11736,7 +12108,7 @@
         <w:drawing>
           <wp:inline xmlns:a="http://schemas.openxmlformats.org/drawingml/2006/main" xmlns:pic="http://schemas.openxmlformats.org/drawingml/2006/picture">
             <wp:extent cx="6120000" cy="2669545"/>
-            <wp:docPr id="12" name="Picture 12"/>
+            <wp:docPr id="11" name="Picture 11"/>
             <wp:cNvGraphicFramePr>
               <a:graphicFrameLocks noChangeAspect="1"/>
             </wp:cNvGraphicFramePr>
@@ -11996,7 +12368,7 @@
         <w:drawing>
           <wp:inline xmlns:a="http://schemas.openxmlformats.org/drawingml/2006/main" xmlns:pic="http://schemas.openxmlformats.org/drawingml/2006/picture">
             <wp:extent cx="6120000" cy="3157808"/>
-            <wp:docPr id="13" name="Picture 13"/>
+            <wp:docPr id="12" name="Picture 12"/>
             <wp:cNvGraphicFramePr>
               <a:graphicFrameLocks noChangeAspect="1"/>
             </wp:cNvGraphicFramePr>
@@ -12510,7 +12882,7 @@
         <w:drawing>
           <wp:inline xmlns:a="http://schemas.openxmlformats.org/drawingml/2006/main" xmlns:pic="http://schemas.openxmlformats.org/drawingml/2006/picture">
             <wp:extent cx="6120000" cy="1782524"/>
-            <wp:docPr id="14" name="Picture 14"/>
+            <wp:docPr id="13" name="Picture 13"/>
             <wp:cNvGraphicFramePr>
               <a:graphicFrameLocks noChangeAspect="1"/>
             </wp:cNvGraphicFramePr>
@@ -13440,7 +13812,7 @@
           <w:b w:val="0"/>
           <w:i w:val="0"/>
         </w:rPr>
-        <w:t>Impact data: Može et al., Mendeley Data, doi:10.17632/wsh8rxwd38.1 [4]. Code, trained model bundles, per-impact predictions, figure and table scripts are in the project repository (paper/v3/ for this manuscript; Appendix B).</w:t>
+        <w:t>Impact data: Može et al., Mendeley Data, doi:10.17632/wsh8rxwd38.1 [4]. Code, trained model bundles, per-impact predictions, figure and table scripts are in the project repository (Appendix B).</w:t>
       </w:r>
     </w:p>
     <w:p>
@@ -16044,7 +16416,7 @@
                 <w:b w:val="0"/>
                 <w:sz w:val="15"/>
               </w:rPr>
-              <w:t>paper/v3/: raw7_rerun.py, collect_metrics.py, stats.py, figs.py, screenshots.py, build_paper.py</w:t>
+              <w:t>build scripts: raw7_rerun.py, collect_metrics.py, stats.py, figs.py, screenshots.py, build_paper.py</w:t>
             </w:r>
           </w:p>
         </w:tc>

</xml_diff>

<commit_message>
Paper: cover, contents, then abstract and introduction from page 1
</commit_message>
<xml_diff>
--- a/paper/v3/Droplet_Intelligence_Paper_v3.docx
+++ b/paper/v3/Droplet_Intelligence_Paper_v3.docx
@@ -190,6 +190,19 @@
           <w:sz w:val="36"/>
         </w:rPr>
         <w:t>CONTENTS</w:t>
+      </w:r>
+    </w:p>
+    <w:p>
+      <w:pPr>
+        <w:spacing w:after="40"/>
+      </w:pPr>
+      <w:r>
+        <w:rPr>
+          <w:b/>
+          <w:i w:val="0"/>
+          <w:sz w:val="22"/>
+        </w:rPr>
+        <w:t>Abstract</w:t>
       </w:r>
     </w:p>
     <w:p>
@@ -567,56 +580,6 @@
     </w:p>
     <w:p>
       <w:pPr>
-        <w:spacing w:after="80"/>
-      </w:pPr>
-      <w:r>
-        <w:rPr>
-          <w:rFonts w:ascii="Arial" w:hAnsi="Arial"/>
-          <w:b/>
-          <w:i w:val="0"/>
-          <w:sz w:val="34"/>
-        </w:rPr>
-        <w:t>Droplet Intelligence: physics-informed Gaussian-process prediction of maximum spreading on laser-textured surfaces never seen in training</w:t>
-      </w:r>
-    </w:p>
-    <w:p>
-      <w:pPr>
-        <w:spacing w:after="160"/>
-      </w:pPr>
-      <w:r>
-        <w:rPr>
-          <w:rFonts w:ascii="Arial" w:hAnsi="Arial"/>
-          <w:b w:val="0"/>
-          <w:i w:val="0"/>
-          <w:color w:val="5B6475"/>
-          <w:sz w:val="23"/>
-        </w:rPr>
-        <w:t>Dimensionless inputs, surface-held-out validation, calibrated uncertainty, and image and video measurement front ends</w:t>
-      </w:r>
-    </w:p>
-    <w:p>
-      <w:pPr>
-        <w:spacing w:after="200"/>
-      </w:pPr>
-      <w:r>
-        <w:rPr>
-          <w:b/>
-          <w:i w:val="0"/>
-          <w:sz w:val="20"/>
-        </w:rPr>
-        <w:t>Parth Sharma</w:t>
-      </w:r>
-      <w:r>
-        <w:rPr>
-          <w:b w:val="0"/>
-          <w:i w:val="0"/>
-          <w:sz w:val="20"/>
-        </w:rPr>
-        <w:t xml:space="preserve"> · Thapar Institute of Engineering &amp; Technology, Patiala, India</w:t>
-      </w:r>
-    </w:p>
-    <w:p>
-      <w:pPr>
         <w:spacing w:after="40"/>
       </w:pPr>
       <w:r>
@@ -781,9 +744,6 @@
           <w:sz w:val="19"/>
         </w:rPr>
         <w:t xml:space="preserve"> drop impact; maximum spreading; laser-textured superhydrophobic surfaces; Gaussian process regression; dimensionless analysis; leave-one-surface-out validation; uncertainty calibration; SEM image analysis; high-speed video</w:t>
-      </w:r>
-      <w:r>
-        <w:br w:type="page"/>
       </w:r>
     </w:p>
     <w:p>

</xml_diff>

<commit_message>
Paper: cover, contents, introduction from page 1; abstract and verification appendix removed; running header; table formatting
</commit_message>
<xml_diff>
--- a/paper/v3/Droplet_Intelligence_Paper_v3.docx
+++ b/paper/v3/Droplet_Intelligence_Paper_v3.docx
@@ -190,19 +190,6 @@
           <w:sz w:val="36"/>
         </w:rPr>
         <w:t>CONTENTS</w:t>
-      </w:r>
-    </w:p>
-    <w:p>
-      <w:pPr>
-        <w:spacing w:after="40"/>
-      </w:pPr>
-      <w:r>
-        <w:rPr>
-          <w:b/>
-          <w:i w:val="0"/>
-          <w:sz w:val="22"/>
-        </w:rPr>
-        <w:t>Abstract</w:t>
       </w:r>
     </w:p>
     <w:p>
@@ -561,189 +548,8 @@
         </w:rPr>
         <w:t>Appendix B. Reproducibility</w:t>
       </w:r>
-    </w:p>
-    <w:p>
-      <w:pPr>
-        <w:spacing w:after="40"/>
-      </w:pPr>
-      <w:r>
-        <w:rPr>
-          <w:b/>
-          <w:i w:val="0"/>
-          <w:sz w:val="22"/>
-        </w:rPr>
-        <w:t>Appendix C. Verification report</w:t>
-      </w:r>
       <w:r>
         <w:br w:type="page"/>
-      </w:r>
-    </w:p>
-    <w:p>
-      <w:pPr>
-        <w:spacing w:after="40"/>
-      </w:pPr>
-      <w:r>
-        <w:rPr>
-          <w:rFonts w:ascii="Arial" w:hAnsi="Arial"/>
-          <w:b/>
-          <w:i w:val="0"/>
-          <w:sz w:val="23"/>
-        </w:rPr>
-        <w:t>Abstract</w:t>
-      </w:r>
-    </w:p>
-    <w:p>
-      <w:pPr>
-        <w:spacing w:after="80"/>
-        <w:jc w:val="both"/>
-      </w:pPr>
-      <w:r>
-        <w:rPr>
-          <w:b w:val="0"/>
-          <w:i w:val="0"/>
-          <w:sz w:val="20"/>
-        </w:rPr>
-        <w:t>The maximum spreading ratio β</w:t>
-      </w:r>
-      <w:r>
-        <w:rPr>
-          <w:b w:val="0"/>
-          <w:i w:val="0"/>
-          <w:sz w:val="20"/>
-          <w:vertAlign w:val="subscript"/>
-        </w:rPr>
-        <w:t>max</w:t>
-      </w:r>
-      <w:r>
-        <w:rPr>
-          <w:b w:val="0"/>
-          <w:i w:val="0"/>
-          <w:sz w:val="20"/>
-        </w:rPr>
-        <w:t xml:space="preserve"> = D</w:t>
-      </w:r>
-      <w:r>
-        <w:rPr>
-          <w:b w:val="0"/>
-          <w:i w:val="0"/>
-          <w:sz w:val="20"/>
-          <w:vertAlign w:val="subscript"/>
-        </w:rPr>
-        <w:t>max</w:t>
-      </w:r>
-      <w:r>
-        <w:rPr>
-          <w:b w:val="0"/>
-          <w:i w:val="0"/>
-          <w:sz w:val="20"/>
-        </w:rPr>
-        <w:t>/D</w:t>
-      </w:r>
-      <w:r>
-        <w:rPr>
-          <w:b w:val="0"/>
-          <w:i w:val="0"/>
-          <w:sz w:val="20"/>
-          <w:vertAlign w:val="subscript"/>
-        </w:rPr>
-        <w:t>0</w:t>
-      </w:r>
-      <w:r>
-        <w:rPr>
-          <w:b w:val="0"/>
-          <w:i w:val="0"/>
-          <w:sz w:val="20"/>
-        </w:rPr>
-        <w:t xml:space="preserve"> of an impacting drop sets how much surface a drop wets, yet data-driven models of it are usually scored on random splits in which every surface is also in training. We ask the design question instead: how accurately can β</w:t>
-      </w:r>
-      <w:r>
-        <w:rPr>
-          <w:b w:val="0"/>
-          <w:i w:val="0"/>
-          <w:sz w:val="20"/>
-          <w:vertAlign w:val="subscript"/>
-        </w:rPr>
-        <w:t>max</w:t>
-      </w:r>
-      <w:r>
-        <w:rPr>
-          <w:b w:val="0"/>
-          <w:i w:val="0"/>
-          <w:sz w:val="20"/>
-        </w:rPr>
-        <w:t xml:space="preserve"> be predicted on a textured surface that has never been seen? Using a public dataset of 1,498 impacts on 12 laser-textured aluminium surfaces and 125 on a smooth hydrophobic plate (REF-H), five water–glycerol mixtures and Re = 8.9–4,435, We = 8.0–119, we represent each impact by ln Re, ln We, ln D</w:t>
-      </w:r>
-      <w:r>
-        <w:rPr>
-          <w:b w:val="0"/>
-          <w:i w:val="0"/>
-          <w:sz w:val="20"/>
-          <w:vertAlign w:val="subscript"/>
-        </w:rPr>
-        <w:t>0</w:t>
-      </w:r>
-      <w:r>
-        <w:rPr>
-          <w:b w:val="0"/>
-          <w:i w:val="0"/>
-          <w:sz w:val="20"/>
-        </w:rPr>
-        <w:t xml:space="preserve"> and two texture descriptors, and evaluate every model by leave-one-surface-out (LOSO) cross-validation with a paired bootstrap over surfaces. A Matérn-3/2 Gaussian process (GP) reaches a LOSO RMSE of 0.0400 (R² = 0.991, MAE = 0.0242), against 0.0563 for XGBoost on identical inputs (difference interval [+0.005, +0.028]) and 0.250 for the Laan scaling law alone; 12 other learners ranked below the GP. On REF-H, never used for training or selection, the GP scores 0.0591. Its 90% intervals, calibrated on cross-validated residuals, cover 90.1% of held-out textured impacts but only 61.6% on REF-H, failing mostly for low-viscosity drops. Several alternatives scored lower RMSE (dimensional inputs 0.0372, a Laan-backbone residual GP 0.0388), but none differed significantly from the baseline. Adding ln Oh changes nothing because ln Oh = ½ ln We − ln Re; contact-angle inputs degrade REF-H. The texture fraction φ can be read from a 43× SEM image with no loss of accuracy (LOSO 0.0397), and a video pipeline recovers D</w:t>
-      </w:r>
-      <w:r>
-        <w:rPr>
-          <w:b w:val="0"/>
-          <w:i w:val="0"/>
-          <w:sz w:val="20"/>
-          <w:vertAlign w:val="subscript"/>
-        </w:rPr>
-        <w:t>0</w:t>
-      </w:r>
-      <w:r>
-        <w:rPr>
-          <w:b w:val="0"/>
-          <w:i w:val="0"/>
-          <w:sz w:val="20"/>
-        </w:rPr>
-        <w:t>, V and β</w:t>
-      </w:r>
-      <w:r>
-        <w:rPr>
-          <w:b w:val="0"/>
-          <w:i w:val="0"/>
-          <w:sz w:val="20"/>
-          <w:vertAlign w:val="subscript"/>
-        </w:rPr>
-        <w:t>max</w:t>
-      </w:r>
-      <w:r>
-        <w:rPr>
-          <w:b w:val="0"/>
-          <w:i w:val="0"/>
-          <w:sz w:val="20"/>
-        </w:rPr>
-        <w:t xml:space="preserve"> of synthetic test clips to within 1.9%. The same GP runs in a browser in about 2 ms per query.</w:t>
-      </w:r>
-    </w:p>
-    <w:p>
-      <w:pPr>
-        <w:spacing w:after="200"/>
-      </w:pPr>
-      <w:r>
-        <w:rPr>
-          <w:b/>
-          <w:i w:val="0"/>
-          <w:sz w:val="19"/>
-        </w:rPr>
-        <w:t>Keywords:</w:t>
-      </w:r>
-      <w:r>
-        <w:rPr>
-          <w:b w:val="0"/>
-          <w:i w:val="0"/>
-          <w:sz w:val="19"/>
-        </w:rPr>
-        <w:t xml:space="preserve"> drop impact; maximum spreading; laser-textured superhydrophobic surfaces; Gaussian process regression; dimensionless analysis; leave-one-surface-out validation; uncertainty calibration; SEM image analysis; high-speed video</w:t>
       </w:r>
     </w:p>
     <w:p>
@@ -6005,7 +5811,7 @@
       <w:tr>
         <w:tc>
           <w:tcPr>
-            <w:tcW w:type="dxa" w:w="2024"/>
+            <w:tcW w:type="dxa" w:w="2336"/>
             <w:shd w:val="clear" w:color="auto" w:fill="EEF2F7"/>
           </w:tcPr>
           <w:p>
@@ -6021,7 +5827,7 @@
         </w:tc>
         <w:tc>
           <w:tcPr>
-            <w:tcW w:type="dxa" w:w="1253"/>
+            <w:tcW w:type="dxa" w:w="1266"/>
             <w:shd w:val="clear" w:color="auto" w:fill="EEF2F7"/>
           </w:tcPr>
           <w:p>
@@ -6037,7 +5843,7 @@
         </w:tc>
         <w:tc>
           <w:tcPr>
-            <w:tcW w:type="dxa" w:w="675"/>
+            <w:tcW w:type="dxa" w:w="633"/>
             <w:shd w:val="clear" w:color="auto" w:fill="EEF2F7"/>
           </w:tcPr>
           <w:p>
@@ -6053,7 +5859,7 @@
         </w:tc>
         <w:tc>
           <w:tcPr>
-            <w:tcW w:type="dxa" w:w="675"/>
+            <w:tcW w:type="dxa" w:w="633"/>
             <w:shd w:val="clear" w:color="auto" w:fill="EEF2F7"/>
           </w:tcPr>
           <w:p>
@@ -6069,7 +5875,7 @@
         </w:tc>
         <w:tc>
           <w:tcPr>
-            <w:tcW w:type="dxa" w:w="675"/>
+            <w:tcW w:type="dxa" w:w="633"/>
             <w:shd w:val="clear" w:color="auto" w:fill="EEF2F7"/>
           </w:tcPr>
           <w:p>
@@ -6085,7 +5891,7 @@
         </w:tc>
         <w:tc>
           <w:tcPr>
-            <w:tcW w:type="dxa" w:w="675"/>
+            <w:tcW w:type="dxa" w:w="633"/>
             <w:shd w:val="clear" w:color="auto" w:fill="EEF2F7"/>
           </w:tcPr>
           <w:p>
@@ -6101,7 +5907,7 @@
         </w:tc>
         <w:tc>
           <w:tcPr>
-            <w:tcW w:type="dxa" w:w="675"/>
+            <w:tcW w:type="dxa" w:w="633"/>
             <w:shd w:val="clear" w:color="auto" w:fill="EEF2F7"/>
           </w:tcPr>
           <w:p>
@@ -6117,7 +5923,7 @@
         </w:tc>
         <w:tc>
           <w:tcPr>
-            <w:tcW w:type="dxa" w:w="675"/>
+            <w:tcW w:type="dxa" w:w="633"/>
             <w:shd w:val="clear" w:color="auto" w:fill="EEF2F7"/>
           </w:tcPr>
           <w:p>
@@ -6133,7 +5939,7 @@
         </w:tc>
         <w:tc>
           <w:tcPr>
-            <w:tcW w:type="dxa" w:w="675"/>
+            <w:tcW w:type="dxa" w:w="633"/>
             <w:shd w:val="clear" w:color="auto" w:fill="EEF2F7"/>
           </w:tcPr>
           <w:p>
@@ -6149,7 +5955,7 @@
         </w:tc>
         <w:tc>
           <w:tcPr>
-            <w:tcW w:type="dxa" w:w="1638"/>
+            <w:tcW w:type="dxa" w:w="1606"/>
             <w:shd w:val="clear" w:color="auto" w:fill="EEF2F7"/>
           </w:tcPr>
           <w:p>
@@ -6167,7 +5973,7 @@
       <w:tr>
         <w:tc>
           <w:tcPr>
-            <w:tcW w:type="dxa" w:w="2024"/>
+            <w:tcW w:type="dxa" w:w="2336"/>
           </w:tcPr>
           <w:p>
             <w:r/>
@@ -6182,7 +5988,7 @@
         </w:tc>
         <w:tc>
           <w:tcPr>
-            <w:tcW w:type="dxa" w:w="1253"/>
+            <w:tcW w:type="dxa" w:w="1266"/>
           </w:tcPr>
           <w:p>
             <w:r/>
@@ -6197,7 +6003,7 @@
         </w:tc>
         <w:tc>
           <w:tcPr>
-            <w:tcW w:type="dxa" w:w="675"/>
+            <w:tcW w:type="dxa" w:w="633"/>
           </w:tcPr>
           <w:p>
             <w:r/>
@@ -6212,7 +6018,7 @@
         </w:tc>
         <w:tc>
           <w:tcPr>
-            <w:tcW w:type="dxa" w:w="675"/>
+            <w:tcW w:type="dxa" w:w="633"/>
           </w:tcPr>
           <w:p>
             <w:r/>
@@ -6227,7 +6033,7 @@
         </w:tc>
         <w:tc>
           <w:tcPr>
-            <w:tcW w:type="dxa" w:w="675"/>
+            <w:tcW w:type="dxa" w:w="633"/>
           </w:tcPr>
           <w:p>
             <w:r/>
@@ -6242,7 +6048,7 @@
         </w:tc>
         <w:tc>
           <w:tcPr>
-            <w:tcW w:type="dxa" w:w="675"/>
+            <w:tcW w:type="dxa" w:w="633"/>
           </w:tcPr>
           <w:p>
             <w:r/>
@@ -6257,7 +6063,7 @@
         </w:tc>
         <w:tc>
           <w:tcPr>
-            <w:tcW w:type="dxa" w:w="675"/>
+            <w:tcW w:type="dxa" w:w="633"/>
           </w:tcPr>
           <w:p>
             <w:r/>
@@ -6272,7 +6078,7 @@
         </w:tc>
         <w:tc>
           <w:tcPr>
-            <w:tcW w:type="dxa" w:w="675"/>
+            <w:tcW w:type="dxa" w:w="633"/>
           </w:tcPr>
           <w:p>
             <w:r/>
@@ -6287,7 +6093,7 @@
         </w:tc>
         <w:tc>
           <w:tcPr>
-            <w:tcW w:type="dxa" w:w="675"/>
+            <w:tcW w:type="dxa" w:w="633"/>
           </w:tcPr>
           <w:p>
             <w:r/>
@@ -6302,7 +6108,7 @@
         </w:tc>
         <w:tc>
           <w:tcPr>
-            <w:tcW w:type="dxa" w:w="1638"/>
+            <w:tcW w:type="dxa" w:w="1606"/>
           </w:tcPr>
           <w:p>
             <w:r/>
@@ -6319,7 +6125,7 @@
       <w:tr>
         <w:tc>
           <w:tcPr>
-            <w:tcW w:type="dxa" w:w="2024"/>
+            <w:tcW w:type="dxa" w:w="2336"/>
           </w:tcPr>
           <w:p>
             <w:r/>
@@ -6334,7 +6140,7 @@
         </w:tc>
         <w:tc>
           <w:tcPr>
-            <w:tcW w:type="dxa" w:w="1253"/>
+            <w:tcW w:type="dxa" w:w="1266"/>
           </w:tcPr>
           <w:p>
             <w:r/>
@@ -6349,7 +6155,7 @@
         </w:tc>
         <w:tc>
           <w:tcPr>
-            <w:tcW w:type="dxa" w:w="675"/>
+            <w:tcW w:type="dxa" w:w="633"/>
           </w:tcPr>
           <w:p>
             <w:r/>
@@ -6364,7 +6170,7 @@
         </w:tc>
         <w:tc>
           <w:tcPr>
-            <w:tcW w:type="dxa" w:w="675"/>
+            <w:tcW w:type="dxa" w:w="633"/>
           </w:tcPr>
           <w:p>
             <w:r/>
@@ -6379,7 +6185,7 @@
         </w:tc>
         <w:tc>
           <w:tcPr>
-            <w:tcW w:type="dxa" w:w="675"/>
+            <w:tcW w:type="dxa" w:w="633"/>
           </w:tcPr>
           <w:p>
             <w:r/>
@@ -6394,7 +6200,7 @@
         </w:tc>
         <w:tc>
           <w:tcPr>
-            <w:tcW w:type="dxa" w:w="675"/>
+            <w:tcW w:type="dxa" w:w="633"/>
           </w:tcPr>
           <w:p>
             <w:r/>
@@ -6409,7 +6215,7 @@
         </w:tc>
         <w:tc>
           <w:tcPr>
-            <w:tcW w:type="dxa" w:w="675"/>
+            <w:tcW w:type="dxa" w:w="633"/>
           </w:tcPr>
           <w:p>
             <w:r/>
@@ -6424,7 +6230,7 @@
         </w:tc>
         <w:tc>
           <w:tcPr>
-            <w:tcW w:type="dxa" w:w="675"/>
+            <w:tcW w:type="dxa" w:w="633"/>
           </w:tcPr>
           <w:p>
             <w:r/>
@@ -6439,7 +6245,7 @@
         </w:tc>
         <w:tc>
           <w:tcPr>
-            <w:tcW w:type="dxa" w:w="675"/>
+            <w:tcW w:type="dxa" w:w="633"/>
           </w:tcPr>
           <w:p>
             <w:r/>
@@ -6454,7 +6260,7 @@
         </w:tc>
         <w:tc>
           <w:tcPr>
-            <w:tcW w:type="dxa" w:w="1638"/>
+            <w:tcW w:type="dxa" w:w="1606"/>
           </w:tcPr>
           <w:p>
             <w:r/>
@@ -6471,7 +6277,7 @@
       <w:tr>
         <w:tc>
           <w:tcPr>
-            <w:tcW w:type="dxa" w:w="2024"/>
+            <w:tcW w:type="dxa" w:w="2336"/>
           </w:tcPr>
           <w:p>
             <w:r/>
@@ -6486,7 +6292,7 @@
         </w:tc>
         <w:tc>
           <w:tcPr>
-            <w:tcW w:type="dxa" w:w="1253"/>
+            <w:tcW w:type="dxa" w:w="1266"/>
           </w:tcPr>
           <w:p>
             <w:r/>
@@ -6501,7 +6307,7 @@
         </w:tc>
         <w:tc>
           <w:tcPr>
-            <w:tcW w:type="dxa" w:w="675"/>
+            <w:tcW w:type="dxa" w:w="633"/>
           </w:tcPr>
           <w:p>
             <w:r/>
@@ -6516,7 +6322,7 @@
         </w:tc>
         <w:tc>
           <w:tcPr>
-            <w:tcW w:type="dxa" w:w="675"/>
+            <w:tcW w:type="dxa" w:w="633"/>
           </w:tcPr>
           <w:p>
             <w:r/>
@@ -6531,7 +6337,7 @@
         </w:tc>
         <w:tc>
           <w:tcPr>
-            <w:tcW w:type="dxa" w:w="675"/>
+            <w:tcW w:type="dxa" w:w="633"/>
           </w:tcPr>
           <w:p>
             <w:r/>
@@ -6546,7 +6352,7 @@
         </w:tc>
         <w:tc>
           <w:tcPr>
-            <w:tcW w:type="dxa" w:w="675"/>
+            <w:tcW w:type="dxa" w:w="633"/>
           </w:tcPr>
           <w:p>
             <w:r/>
@@ -6561,7 +6367,7 @@
         </w:tc>
         <w:tc>
           <w:tcPr>
-            <w:tcW w:type="dxa" w:w="675"/>
+            <w:tcW w:type="dxa" w:w="633"/>
           </w:tcPr>
           <w:p>
             <w:r/>
@@ -6576,7 +6382,7 @@
         </w:tc>
         <w:tc>
           <w:tcPr>
-            <w:tcW w:type="dxa" w:w="675"/>
+            <w:tcW w:type="dxa" w:w="633"/>
           </w:tcPr>
           <w:p>
             <w:r/>
@@ -6591,7 +6397,7 @@
         </w:tc>
         <w:tc>
           <w:tcPr>
-            <w:tcW w:type="dxa" w:w="675"/>
+            <w:tcW w:type="dxa" w:w="633"/>
           </w:tcPr>
           <w:p>
             <w:r/>
@@ -6606,7 +6412,7 @@
         </w:tc>
         <w:tc>
           <w:tcPr>
-            <w:tcW w:type="dxa" w:w="1638"/>
+            <w:tcW w:type="dxa" w:w="1606"/>
           </w:tcPr>
           <w:p>
             <w:r/>
@@ -6623,7 +6429,7 @@
       <w:tr>
         <w:tc>
           <w:tcPr>
-            <w:tcW w:type="dxa" w:w="2024"/>
+            <w:tcW w:type="dxa" w:w="2336"/>
           </w:tcPr>
           <w:p>
             <w:r/>
@@ -6638,7 +6444,7 @@
         </w:tc>
         <w:tc>
           <w:tcPr>
-            <w:tcW w:type="dxa" w:w="1253"/>
+            <w:tcW w:type="dxa" w:w="1266"/>
           </w:tcPr>
           <w:p>
             <w:r/>
@@ -6653,7 +6459,7 @@
         </w:tc>
         <w:tc>
           <w:tcPr>
-            <w:tcW w:type="dxa" w:w="675"/>
+            <w:tcW w:type="dxa" w:w="633"/>
           </w:tcPr>
           <w:p>
             <w:r/>
@@ -6668,7 +6474,7 @@
         </w:tc>
         <w:tc>
           <w:tcPr>
-            <w:tcW w:type="dxa" w:w="675"/>
+            <w:tcW w:type="dxa" w:w="633"/>
           </w:tcPr>
           <w:p>
             <w:r/>
@@ -6683,7 +6489,7 @@
         </w:tc>
         <w:tc>
           <w:tcPr>
-            <w:tcW w:type="dxa" w:w="675"/>
+            <w:tcW w:type="dxa" w:w="633"/>
           </w:tcPr>
           <w:p>
             <w:r/>
@@ -6698,7 +6504,7 @@
         </w:tc>
         <w:tc>
           <w:tcPr>
-            <w:tcW w:type="dxa" w:w="675"/>
+            <w:tcW w:type="dxa" w:w="633"/>
           </w:tcPr>
           <w:p>
             <w:r/>
@@ -6713,7 +6519,7 @@
         </w:tc>
         <w:tc>
           <w:tcPr>
-            <w:tcW w:type="dxa" w:w="675"/>
+            <w:tcW w:type="dxa" w:w="633"/>
           </w:tcPr>
           <w:p>
             <w:r/>
@@ -6728,7 +6534,7 @@
         </w:tc>
         <w:tc>
           <w:tcPr>
-            <w:tcW w:type="dxa" w:w="675"/>
+            <w:tcW w:type="dxa" w:w="633"/>
           </w:tcPr>
           <w:p>
             <w:r/>
@@ -6743,7 +6549,7 @@
         </w:tc>
         <w:tc>
           <w:tcPr>
-            <w:tcW w:type="dxa" w:w="675"/>
+            <w:tcW w:type="dxa" w:w="633"/>
           </w:tcPr>
           <w:p>
             <w:r/>
@@ -6758,7 +6564,7 @@
         </w:tc>
         <w:tc>
           <w:tcPr>
-            <w:tcW w:type="dxa" w:w="1638"/>
+            <w:tcW w:type="dxa" w:w="1606"/>
           </w:tcPr>
           <w:p>
             <w:r/>
@@ -6775,7 +6581,7 @@
       <w:tr>
         <w:tc>
           <w:tcPr>
-            <w:tcW w:type="dxa" w:w="2024"/>
+            <w:tcW w:type="dxa" w:w="2336"/>
           </w:tcPr>
           <w:p>
             <w:r/>
@@ -6790,7 +6596,7 @@
         </w:tc>
         <w:tc>
           <w:tcPr>
-            <w:tcW w:type="dxa" w:w="1253"/>
+            <w:tcW w:type="dxa" w:w="1266"/>
           </w:tcPr>
           <w:p>
             <w:r/>
@@ -6805,7 +6611,7 @@
         </w:tc>
         <w:tc>
           <w:tcPr>
-            <w:tcW w:type="dxa" w:w="675"/>
+            <w:tcW w:type="dxa" w:w="633"/>
           </w:tcPr>
           <w:p>
             <w:r/>
@@ -6820,7 +6626,7 @@
         </w:tc>
         <w:tc>
           <w:tcPr>
-            <w:tcW w:type="dxa" w:w="675"/>
+            <w:tcW w:type="dxa" w:w="633"/>
           </w:tcPr>
           <w:p>
             <w:r/>
@@ -6835,7 +6641,7 @@
         </w:tc>
         <w:tc>
           <w:tcPr>
-            <w:tcW w:type="dxa" w:w="675"/>
+            <w:tcW w:type="dxa" w:w="633"/>
           </w:tcPr>
           <w:p>
             <w:r/>
@@ -6850,7 +6656,7 @@
         </w:tc>
         <w:tc>
           <w:tcPr>
-            <w:tcW w:type="dxa" w:w="675"/>
+            <w:tcW w:type="dxa" w:w="633"/>
           </w:tcPr>
           <w:p>
             <w:r/>
@@ -6865,7 +6671,7 @@
         </w:tc>
         <w:tc>
           <w:tcPr>
-            <w:tcW w:type="dxa" w:w="675"/>
+            <w:tcW w:type="dxa" w:w="633"/>
           </w:tcPr>
           <w:p>
             <w:r/>
@@ -6880,7 +6686,7 @@
         </w:tc>
         <w:tc>
           <w:tcPr>
-            <w:tcW w:type="dxa" w:w="675"/>
+            <w:tcW w:type="dxa" w:w="633"/>
           </w:tcPr>
           <w:p>
             <w:r/>
@@ -6895,7 +6701,7 @@
         </w:tc>
         <w:tc>
           <w:tcPr>
-            <w:tcW w:type="dxa" w:w="675"/>
+            <w:tcW w:type="dxa" w:w="633"/>
           </w:tcPr>
           <w:p>
             <w:r/>
@@ -6910,7 +6716,7 @@
         </w:tc>
         <w:tc>
           <w:tcPr>
-            <w:tcW w:type="dxa" w:w="1638"/>
+            <w:tcW w:type="dxa" w:w="1606"/>
           </w:tcPr>
           <w:p>
             <w:r/>
@@ -6927,7 +6733,7 @@
       <w:tr>
         <w:tc>
           <w:tcPr>
-            <w:tcW w:type="dxa" w:w="2024"/>
+            <w:tcW w:type="dxa" w:w="2336"/>
           </w:tcPr>
           <w:p>
             <w:r/>
@@ -6942,7 +6748,7 @@
         </w:tc>
         <w:tc>
           <w:tcPr>
-            <w:tcW w:type="dxa" w:w="1253"/>
+            <w:tcW w:type="dxa" w:w="1266"/>
           </w:tcPr>
           <w:p>
             <w:r/>
@@ -6957,7 +6763,7 @@
         </w:tc>
         <w:tc>
           <w:tcPr>
-            <w:tcW w:type="dxa" w:w="675"/>
+            <w:tcW w:type="dxa" w:w="633"/>
           </w:tcPr>
           <w:p>
             <w:r/>
@@ -6972,7 +6778,7 @@
         </w:tc>
         <w:tc>
           <w:tcPr>
-            <w:tcW w:type="dxa" w:w="675"/>
+            <w:tcW w:type="dxa" w:w="633"/>
           </w:tcPr>
           <w:p>
             <w:r/>
@@ -6987,7 +6793,7 @@
         </w:tc>
         <w:tc>
           <w:tcPr>
-            <w:tcW w:type="dxa" w:w="675"/>
+            <w:tcW w:type="dxa" w:w="633"/>
           </w:tcPr>
           <w:p>
             <w:r/>
@@ -7002,7 +6808,7 @@
         </w:tc>
         <w:tc>
           <w:tcPr>
-            <w:tcW w:type="dxa" w:w="675"/>
+            <w:tcW w:type="dxa" w:w="633"/>
           </w:tcPr>
           <w:p>
             <w:r/>
@@ -7017,7 +6823,7 @@
         </w:tc>
         <w:tc>
           <w:tcPr>
-            <w:tcW w:type="dxa" w:w="675"/>
+            <w:tcW w:type="dxa" w:w="633"/>
           </w:tcPr>
           <w:p>
             <w:r/>
@@ -7032,7 +6838,7 @@
         </w:tc>
         <w:tc>
           <w:tcPr>
-            <w:tcW w:type="dxa" w:w="675"/>
+            <w:tcW w:type="dxa" w:w="633"/>
           </w:tcPr>
           <w:p>
             <w:r/>
@@ -7047,7 +6853,7 @@
         </w:tc>
         <w:tc>
           <w:tcPr>
-            <w:tcW w:type="dxa" w:w="675"/>
+            <w:tcW w:type="dxa" w:w="633"/>
           </w:tcPr>
           <w:p>
             <w:r/>
@@ -7062,7 +6868,7 @@
         </w:tc>
         <w:tc>
           <w:tcPr>
-            <w:tcW w:type="dxa" w:w="1638"/>
+            <w:tcW w:type="dxa" w:w="1606"/>
           </w:tcPr>
           <w:p>
             <w:r/>
@@ -7079,7 +6885,7 @@
       <w:tr>
         <w:tc>
           <w:tcPr>
-            <w:tcW w:type="dxa" w:w="2024"/>
+            <w:tcW w:type="dxa" w:w="2336"/>
           </w:tcPr>
           <w:p>
             <w:r/>
@@ -7094,7 +6900,7 @@
         </w:tc>
         <w:tc>
           <w:tcPr>
-            <w:tcW w:type="dxa" w:w="1253"/>
+            <w:tcW w:type="dxa" w:w="1266"/>
           </w:tcPr>
           <w:p>
             <w:r/>
@@ -7109,7 +6915,7 @@
         </w:tc>
         <w:tc>
           <w:tcPr>
-            <w:tcW w:type="dxa" w:w="675"/>
+            <w:tcW w:type="dxa" w:w="633"/>
           </w:tcPr>
           <w:p>
             <w:r/>
@@ -7124,7 +6930,7 @@
         </w:tc>
         <w:tc>
           <w:tcPr>
-            <w:tcW w:type="dxa" w:w="675"/>
+            <w:tcW w:type="dxa" w:w="633"/>
           </w:tcPr>
           <w:p>
             <w:r/>
@@ -7139,7 +6945,7 @@
         </w:tc>
         <w:tc>
           <w:tcPr>
-            <w:tcW w:type="dxa" w:w="675"/>
+            <w:tcW w:type="dxa" w:w="633"/>
           </w:tcPr>
           <w:p>
             <w:r/>
@@ -7154,7 +6960,7 @@
         </w:tc>
         <w:tc>
           <w:tcPr>
-            <w:tcW w:type="dxa" w:w="675"/>
+            <w:tcW w:type="dxa" w:w="633"/>
           </w:tcPr>
           <w:p>
             <w:r/>
@@ -7169,7 +6975,7 @@
         </w:tc>
         <w:tc>
           <w:tcPr>
-            <w:tcW w:type="dxa" w:w="675"/>
+            <w:tcW w:type="dxa" w:w="633"/>
           </w:tcPr>
           <w:p>
             <w:r/>
@@ -7184,7 +6990,7 @@
         </w:tc>
         <w:tc>
           <w:tcPr>
-            <w:tcW w:type="dxa" w:w="675"/>
+            <w:tcW w:type="dxa" w:w="633"/>
           </w:tcPr>
           <w:p>
             <w:r/>
@@ -7199,7 +7005,7 @@
         </w:tc>
         <w:tc>
           <w:tcPr>
-            <w:tcW w:type="dxa" w:w="675"/>
+            <w:tcW w:type="dxa" w:w="633"/>
           </w:tcPr>
           <w:p>
             <w:r/>
@@ -7214,7 +7020,7 @@
         </w:tc>
         <w:tc>
           <w:tcPr>
-            <w:tcW w:type="dxa" w:w="1638"/>
+            <w:tcW w:type="dxa" w:w="1606"/>
           </w:tcPr>
           <w:p>
             <w:r/>
@@ -7231,7 +7037,7 @@
       <w:tr>
         <w:tc>
           <w:tcPr>
-            <w:tcW w:type="dxa" w:w="2024"/>
+            <w:tcW w:type="dxa" w:w="2336"/>
           </w:tcPr>
           <w:p>
             <w:r/>
@@ -7246,7 +7052,7 @@
         </w:tc>
         <w:tc>
           <w:tcPr>
-            <w:tcW w:type="dxa" w:w="1253"/>
+            <w:tcW w:type="dxa" w:w="1266"/>
           </w:tcPr>
           <w:p>
             <w:r/>
@@ -7261,7 +7067,7 @@
         </w:tc>
         <w:tc>
           <w:tcPr>
-            <w:tcW w:type="dxa" w:w="675"/>
+            <w:tcW w:type="dxa" w:w="633"/>
           </w:tcPr>
           <w:p>
             <w:r/>
@@ -7276,7 +7082,7 @@
         </w:tc>
         <w:tc>
           <w:tcPr>
-            <w:tcW w:type="dxa" w:w="675"/>
+            <w:tcW w:type="dxa" w:w="633"/>
           </w:tcPr>
           <w:p>
             <w:r/>
@@ -7291,7 +7097,7 @@
         </w:tc>
         <w:tc>
           <w:tcPr>
-            <w:tcW w:type="dxa" w:w="675"/>
+            <w:tcW w:type="dxa" w:w="633"/>
           </w:tcPr>
           <w:p>
             <w:r/>
@@ -7306,7 +7112,7 @@
         </w:tc>
         <w:tc>
           <w:tcPr>
-            <w:tcW w:type="dxa" w:w="675"/>
+            <w:tcW w:type="dxa" w:w="633"/>
           </w:tcPr>
           <w:p>
             <w:r/>
@@ -7321,7 +7127,7 @@
         </w:tc>
         <w:tc>
           <w:tcPr>
-            <w:tcW w:type="dxa" w:w="675"/>
+            <w:tcW w:type="dxa" w:w="633"/>
           </w:tcPr>
           <w:p>
             <w:r/>
@@ -7336,7 +7142,7 @@
         </w:tc>
         <w:tc>
           <w:tcPr>
-            <w:tcW w:type="dxa" w:w="675"/>
+            <w:tcW w:type="dxa" w:w="633"/>
           </w:tcPr>
           <w:p>
             <w:r/>
@@ -7351,7 +7157,7 @@
         </w:tc>
         <w:tc>
           <w:tcPr>
-            <w:tcW w:type="dxa" w:w="675"/>
+            <w:tcW w:type="dxa" w:w="633"/>
           </w:tcPr>
           <w:p>
             <w:r/>
@@ -7366,7 +7172,7 @@
         </w:tc>
         <w:tc>
           <w:tcPr>
-            <w:tcW w:type="dxa" w:w="1638"/>
+            <w:tcW w:type="dxa" w:w="1606"/>
           </w:tcPr>
           <w:p>
             <w:r/>
@@ -7383,7 +7189,7 @@
       <w:tr>
         <w:tc>
           <w:tcPr>
-            <w:tcW w:type="dxa" w:w="2024"/>
+            <w:tcW w:type="dxa" w:w="2336"/>
           </w:tcPr>
           <w:p>
             <w:r/>
@@ -7398,7 +7204,7 @@
         </w:tc>
         <w:tc>
           <w:tcPr>
-            <w:tcW w:type="dxa" w:w="1253"/>
+            <w:tcW w:type="dxa" w:w="1266"/>
           </w:tcPr>
           <w:p>
             <w:r/>
@@ -7413,7 +7219,7 @@
         </w:tc>
         <w:tc>
           <w:tcPr>
-            <w:tcW w:type="dxa" w:w="675"/>
+            <w:tcW w:type="dxa" w:w="633"/>
           </w:tcPr>
           <w:p>
             <w:r/>
@@ -7428,7 +7234,7 @@
         </w:tc>
         <w:tc>
           <w:tcPr>
-            <w:tcW w:type="dxa" w:w="675"/>
+            <w:tcW w:type="dxa" w:w="633"/>
           </w:tcPr>
           <w:p>
             <w:r/>
@@ -7443,7 +7249,7 @@
         </w:tc>
         <w:tc>
           <w:tcPr>
-            <w:tcW w:type="dxa" w:w="675"/>
+            <w:tcW w:type="dxa" w:w="633"/>
           </w:tcPr>
           <w:p>
             <w:r/>
@@ -7458,7 +7264,7 @@
         </w:tc>
         <w:tc>
           <w:tcPr>
-            <w:tcW w:type="dxa" w:w="675"/>
+            <w:tcW w:type="dxa" w:w="633"/>
           </w:tcPr>
           <w:p>
             <w:r/>
@@ -7473,7 +7279,7 @@
         </w:tc>
         <w:tc>
           <w:tcPr>
-            <w:tcW w:type="dxa" w:w="675"/>
+            <w:tcW w:type="dxa" w:w="633"/>
           </w:tcPr>
           <w:p>
             <w:r/>
@@ -7488,7 +7294,7 @@
         </w:tc>
         <w:tc>
           <w:tcPr>
-            <w:tcW w:type="dxa" w:w="675"/>
+            <w:tcW w:type="dxa" w:w="633"/>
           </w:tcPr>
           <w:p>
             <w:r/>
@@ -7503,7 +7309,7 @@
         </w:tc>
         <w:tc>
           <w:tcPr>
-            <w:tcW w:type="dxa" w:w="675"/>
+            <w:tcW w:type="dxa" w:w="633"/>
           </w:tcPr>
           <w:p>
             <w:r/>
@@ -7518,7 +7324,7 @@
         </w:tc>
         <w:tc>
           <w:tcPr>
-            <w:tcW w:type="dxa" w:w="1638"/>
+            <w:tcW w:type="dxa" w:w="1606"/>
           </w:tcPr>
           <w:p>
             <w:r/>
@@ -7535,7 +7341,7 @@
       <w:tr>
         <w:tc>
           <w:tcPr>
-            <w:tcW w:type="dxa" w:w="2024"/>
+            <w:tcW w:type="dxa" w:w="2336"/>
           </w:tcPr>
           <w:p>
             <w:r/>
@@ -7550,7 +7356,7 @@
         </w:tc>
         <w:tc>
           <w:tcPr>
-            <w:tcW w:type="dxa" w:w="1253"/>
+            <w:tcW w:type="dxa" w:w="1266"/>
           </w:tcPr>
           <w:p>
             <w:r/>
@@ -7565,7 +7371,7 @@
         </w:tc>
         <w:tc>
           <w:tcPr>
-            <w:tcW w:type="dxa" w:w="675"/>
+            <w:tcW w:type="dxa" w:w="633"/>
           </w:tcPr>
           <w:p>
             <w:r/>
@@ -7580,7 +7386,7 @@
         </w:tc>
         <w:tc>
           <w:tcPr>
-            <w:tcW w:type="dxa" w:w="675"/>
+            <w:tcW w:type="dxa" w:w="633"/>
           </w:tcPr>
           <w:p>
             <w:r/>
@@ -7595,7 +7401,7 @@
         </w:tc>
         <w:tc>
           <w:tcPr>
-            <w:tcW w:type="dxa" w:w="675"/>
+            <w:tcW w:type="dxa" w:w="633"/>
           </w:tcPr>
           <w:p>
             <w:r/>
@@ -7610,7 +7416,7 @@
         </w:tc>
         <w:tc>
           <w:tcPr>
-            <w:tcW w:type="dxa" w:w="675"/>
+            <w:tcW w:type="dxa" w:w="633"/>
           </w:tcPr>
           <w:p>
             <w:r/>
@@ -7625,7 +7431,7 @@
         </w:tc>
         <w:tc>
           <w:tcPr>
-            <w:tcW w:type="dxa" w:w="675"/>
+            <w:tcW w:type="dxa" w:w="633"/>
           </w:tcPr>
           <w:p>
             <w:r/>
@@ -7640,7 +7446,7 @@
         </w:tc>
         <w:tc>
           <w:tcPr>
-            <w:tcW w:type="dxa" w:w="675"/>
+            <w:tcW w:type="dxa" w:w="633"/>
           </w:tcPr>
           <w:p>
             <w:r/>
@@ -7655,7 +7461,7 @@
         </w:tc>
         <w:tc>
           <w:tcPr>
-            <w:tcW w:type="dxa" w:w="675"/>
+            <w:tcW w:type="dxa" w:w="633"/>
           </w:tcPr>
           <w:p>
             <w:r/>
@@ -7670,7 +7476,7 @@
         </w:tc>
         <w:tc>
           <w:tcPr>
-            <w:tcW w:type="dxa" w:w="1638"/>
+            <w:tcW w:type="dxa" w:w="1606"/>
           </w:tcPr>
           <w:p>
             <w:r/>
@@ -7687,7 +7493,7 @@
       <w:tr>
         <w:tc>
           <w:tcPr>
-            <w:tcW w:type="dxa" w:w="2024"/>
+            <w:tcW w:type="dxa" w:w="2336"/>
           </w:tcPr>
           <w:p>
             <w:r/>
@@ -7702,7 +7508,7 @@
         </w:tc>
         <w:tc>
           <w:tcPr>
-            <w:tcW w:type="dxa" w:w="1253"/>
+            <w:tcW w:type="dxa" w:w="1266"/>
           </w:tcPr>
           <w:p>
             <w:r/>
@@ -7717,7 +7523,7 @@
         </w:tc>
         <w:tc>
           <w:tcPr>
-            <w:tcW w:type="dxa" w:w="675"/>
+            <w:tcW w:type="dxa" w:w="633"/>
           </w:tcPr>
           <w:p>
             <w:r/>
@@ -7732,7 +7538,7 @@
         </w:tc>
         <w:tc>
           <w:tcPr>
-            <w:tcW w:type="dxa" w:w="675"/>
+            <w:tcW w:type="dxa" w:w="633"/>
           </w:tcPr>
           <w:p>
             <w:r/>
@@ -7747,7 +7553,7 @@
         </w:tc>
         <w:tc>
           <w:tcPr>
-            <w:tcW w:type="dxa" w:w="675"/>
+            <w:tcW w:type="dxa" w:w="633"/>
           </w:tcPr>
           <w:p>
             <w:r/>
@@ -7762,7 +7568,7 @@
         </w:tc>
         <w:tc>
           <w:tcPr>
-            <w:tcW w:type="dxa" w:w="675"/>
+            <w:tcW w:type="dxa" w:w="633"/>
           </w:tcPr>
           <w:p>
             <w:r/>
@@ -7777,7 +7583,7 @@
         </w:tc>
         <w:tc>
           <w:tcPr>
-            <w:tcW w:type="dxa" w:w="675"/>
+            <w:tcW w:type="dxa" w:w="633"/>
           </w:tcPr>
           <w:p>
             <w:r/>
@@ -7792,7 +7598,7 @@
         </w:tc>
         <w:tc>
           <w:tcPr>
-            <w:tcW w:type="dxa" w:w="675"/>
+            <w:tcW w:type="dxa" w:w="633"/>
           </w:tcPr>
           <w:p>
             <w:r/>
@@ -7807,7 +7613,7 @@
         </w:tc>
         <w:tc>
           <w:tcPr>
-            <w:tcW w:type="dxa" w:w="675"/>
+            <w:tcW w:type="dxa" w:w="633"/>
           </w:tcPr>
           <w:p>
             <w:r/>
@@ -7822,7 +7628,7 @@
         </w:tc>
         <w:tc>
           <w:tcPr>
-            <w:tcW w:type="dxa" w:w="1638"/>
+            <w:tcW w:type="dxa" w:w="1606"/>
           </w:tcPr>
           <w:p>
             <w:r/>
@@ -7839,7 +7645,7 @@
       <w:tr>
         <w:tc>
           <w:tcPr>
-            <w:tcW w:type="dxa" w:w="2024"/>
+            <w:tcW w:type="dxa" w:w="2336"/>
           </w:tcPr>
           <w:p>
             <w:r/>
@@ -7854,7 +7660,7 @@
         </w:tc>
         <w:tc>
           <w:tcPr>
-            <w:tcW w:type="dxa" w:w="1253"/>
+            <w:tcW w:type="dxa" w:w="1266"/>
           </w:tcPr>
           <w:p>
             <w:r/>
@@ -7869,7 +7675,7 @@
         </w:tc>
         <w:tc>
           <w:tcPr>
-            <w:tcW w:type="dxa" w:w="675"/>
+            <w:tcW w:type="dxa" w:w="633"/>
           </w:tcPr>
           <w:p>
             <w:r/>
@@ -7884,7 +7690,7 @@
         </w:tc>
         <w:tc>
           <w:tcPr>
-            <w:tcW w:type="dxa" w:w="675"/>
+            <w:tcW w:type="dxa" w:w="633"/>
           </w:tcPr>
           <w:p>
             <w:r/>
@@ -7899,7 +7705,7 @@
         </w:tc>
         <w:tc>
           <w:tcPr>
-            <w:tcW w:type="dxa" w:w="675"/>
+            <w:tcW w:type="dxa" w:w="633"/>
           </w:tcPr>
           <w:p>
             <w:r/>
@@ -7914,7 +7720,7 @@
         </w:tc>
         <w:tc>
           <w:tcPr>
-            <w:tcW w:type="dxa" w:w="675"/>
+            <w:tcW w:type="dxa" w:w="633"/>
           </w:tcPr>
           <w:p>
             <w:r/>
@@ -7929,7 +7735,7 @@
         </w:tc>
         <w:tc>
           <w:tcPr>
-            <w:tcW w:type="dxa" w:w="675"/>
+            <w:tcW w:type="dxa" w:w="633"/>
           </w:tcPr>
           <w:p>
             <w:r/>
@@ -7944,7 +7750,7 @@
         </w:tc>
         <w:tc>
           <w:tcPr>
-            <w:tcW w:type="dxa" w:w="675"/>
+            <w:tcW w:type="dxa" w:w="633"/>
           </w:tcPr>
           <w:p>
             <w:r/>
@@ -7959,7 +7765,7 @@
         </w:tc>
         <w:tc>
           <w:tcPr>
-            <w:tcW w:type="dxa" w:w="675"/>
+            <w:tcW w:type="dxa" w:w="633"/>
           </w:tcPr>
           <w:p>
             <w:r/>
@@ -7974,7 +7780,7 @@
         </w:tc>
         <w:tc>
           <w:tcPr>
-            <w:tcW w:type="dxa" w:w="1638"/>
+            <w:tcW w:type="dxa" w:w="1606"/>
           </w:tcPr>
           <w:p>
             <w:r/>
@@ -7991,7 +7797,7 @@
       <w:tr>
         <w:tc>
           <w:tcPr>
-            <w:tcW w:type="dxa" w:w="2024"/>
+            <w:tcW w:type="dxa" w:w="2336"/>
           </w:tcPr>
           <w:p>
             <w:r/>
@@ -8006,7 +7812,7 @@
         </w:tc>
         <w:tc>
           <w:tcPr>
-            <w:tcW w:type="dxa" w:w="1253"/>
+            <w:tcW w:type="dxa" w:w="1266"/>
           </w:tcPr>
           <w:p>
             <w:r/>
@@ -8021,7 +7827,7 @@
         </w:tc>
         <w:tc>
           <w:tcPr>
-            <w:tcW w:type="dxa" w:w="675"/>
+            <w:tcW w:type="dxa" w:w="633"/>
           </w:tcPr>
           <w:p>
             <w:r/>
@@ -8036,7 +7842,7 @@
         </w:tc>
         <w:tc>
           <w:tcPr>
-            <w:tcW w:type="dxa" w:w="675"/>
+            <w:tcW w:type="dxa" w:w="633"/>
           </w:tcPr>
           <w:p>
             <w:r/>
@@ -8051,7 +7857,7 @@
         </w:tc>
         <w:tc>
           <w:tcPr>
-            <w:tcW w:type="dxa" w:w="675"/>
+            <w:tcW w:type="dxa" w:w="633"/>
           </w:tcPr>
           <w:p>
             <w:r/>
@@ -8066,7 +7872,7 @@
         </w:tc>
         <w:tc>
           <w:tcPr>
-            <w:tcW w:type="dxa" w:w="675"/>
+            <w:tcW w:type="dxa" w:w="633"/>
           </w:tcPr>
           <w:p>
             <w:r/>
@@ -8081,7 +7887,7 @@
         </w:tc>
         <w:tc>
           <w:tcPr>
-            <w:tcW w:type="dxa" w:w="675"/>
+            <w:tcW w:type="dxa" w:w="633"/>
           </w:tcPr>
           <w:p>
             <w:r/>
@@ -8096,7 +7902,7 @@
         </w:tc>
         <w:tc>
           <w:tcPr>
-            <w:tcW w:type="dxa" w:w="675"/>
+            <w:tcW w:type="dxa" w:w="633"/>
           </w:tcPr>
           <w:p>
             <w:r/>
@@ -8111,7 +7917,7 @@
         </w:tc>
         <w:tc>
           <w:tcPr>
-            <w:tcW w:type="dxa" w:w="675"/>
+            <w:tcW w:type="dxa" w:w="633"/>
           </w:tcPr>
           <w:p>
             <w:r/>
@@ -8126,7 +7932,7 @@
         </w:tc>
         <w:tc>
           <w:tcPr>
-            <w:tcW w:type="dxa" w:w="1638"/>
+            <w:tcW w:type="dxa" w:w="1606"/>
           </w:tcPr>
           <w:p>
             <w:r/>
@@ -8143,7 +7949,7 @@
       <w:tr>
         <w:tc>
           <w:tcPr>
-            <w:tcW w:type="dxa" w:w="2024"/>
+            <w:tcW w:type="dxa" w:w="2336"/>
           </w:tcPr>
           <w:p>
             <w:r/>
@@ -8158,7 +7964,7 @@
         </w:tc>
         <w:tc>
           <w:tcPr>
-            <w:tcW w:type="dxa" w:w="1253"/>
+            <w:tcW w:type="dxa" w:w="1266"/>
           </w:tcPr>
           <w:p>
             <w:r/>
@@ -8173,7 +7979,7 @@
         </w:tc>
         <w:tc>
           <w:tcPr>
-            <w:tcW w:type="dxa" w:w="675"/>
+            <w:tcW w:type="dxa" w:w="633"/>
           </w:tcPr>
           <w:p>
             <w:r/>
@@ -8188,7 +7994,7 @@
         </w:tc>
         <w:tc>
           <w:tcPr>
-            <w:tcW w:type="dxa" w:w="675"/>
+            <w:tcW w:type="dxa" w:w="633"/>
           </w:tcPr>
           <w:p>
             <w:r/>
@@ -8203,7 +8009,7 @@
         </w:tc>
         <w:tc>
           <w:tcPr>
-            <w:tcW w:type="dxa" w:w="675"/>
+            <w:tcW w:type="dxa" w:w="633"/>
           </w:tcPr>
           <w:p>
             <w:r/>
@@ -8218,7 +8024,7 @@
         </w:tc>
         <w:tc>
           <w:tcPr>
-            <w:tcW w:type="dxa" w:w="675"/>
+            <w:tcW w:type="dxa" w:w="633"/>
           </w:tcPr>
           <w:p>
             <w:r/>
@@ -8233,7 +8039,7 @@
         </w:tc>
         <w:tc>
           <w:tcPr>
-            <w:tcW w:type="dxa" w:w="675"/>
+            <w:tcW w:type="dxa" w:w="633"/>
           </w:tcPr>
           <w:p>
             <w:r/>
@@ -8248,7 +8054,7 @@
         </w:tc>
         <w:tc>
           <w:tcPr>
-            <w:tcW w:type="dxa" w:w="675"/>
+            <w:tcW w:type="dxa" w:w="633"/>
           </w:tcPr>
           <w:p>
             <w:r/>
@@ -8263,7 +8069,7 @@
         </w:tc>
         <w:tc>
           <w:tcPr>
-            <w:tcW w:type="dxa" w:w="675"/>
+            <w:tcW w:type="dxa" w:w="633"/>
           </w:tcPr>
           <w:p>
             <w:r/>
@@ -8278,7 +8084,7 @@
         </w:tc>
         <w:tc>
           <w:tcPr>
-            <w:tcW w:type="dxa" w:w="1638"/>
+            <w:tcW w:type="dxa" w:w="1606"/>
           </w:tcPr>
           <w:p>
             <w:r/>
@@ -8295,7 +8101,7 @@
       <w:tr>
         <w:tc>
           <w:tcPr>
-            <w:tcW w:type="dxa" w:w="2024"/>
+            <w:tcW w:type="dxa" w:w="2336"/>
           </w:tcPr>
           <w:p>
             <w:r/>
@@ -8310,7 +8116,7 @@
         </w:tc>
         <w:tc>
           <w:tcPr>
-            <w:tcW w:type="dxa" w:w="1253"/>
+            <w:tcW w:type="dxa" w:w="1266"/>
           </w:tcPr>
           <w:p>
             <w:r/>
@@ -8325,7 +8131,7 @@
         </w:tc>
         <w:tc>
           <w:tcPr>
-            <w:tcW w:type="dxa" w:w="675"/>
+            <w:tcW w:type="dxa" w:w="633"/>
           </w:tcPr>
           <w:p>
             <w:r/>
@@ -8340,7 +8146,7 @@
         </w:tc>
         <w:tc>
           <w:tcPr>
-            <w:tcW w:type="dxa" w:w="675"/>
+            <w:tcW w:type="dxa" w:w="633"/>
           </w:tcPr>
           <w:p>
             <w:r/>
@@ -8355,7 +8161,7 @@
         </w:tc>
         <w:tc>
           <w:tcPr>
-            <w:tcW w:type="dxa" w:w="675"/>
+            <w:tcW w:type="dxa" w:w="633"/>
           </w:tcPr>
           <w:p>
             <w:r/>
@@ -8370,7 +8176,7 @@
         </w:tc>
         <w:tc>
           <w:tcPr>
-            <w:tcW w:type="dxa" w:w="675"/>
+            <w:tcW w:type="dxa" w:w="633"/>
           </w:tcPr>
           <w:p>
             <w:r/>
@@ -8385,7 +8191,7 @@
         </w:tc>
         <w:tc>
           <w:tcPr>
-            <w:tcW w:type="dxa" w:w="675"/>
+            <w:tcW w:type="dxa" w:w="633"/>
           </w:tcPr>
           <w:p>
             <w:r/>
@@ -8400,7 +8206,7 @@
         </w:tc>
         <w:tc>
           <w:tcPr>
-            <w:tcW w:type="dxa" w:w="675"/>
+            <w:tcW w:type="dxa" w:w="633"/>
           </w:tcPr>
           <w:p>
             <w:r/>
@@ -8415,7 +8221,7 @@
         </w:tc>
         <w:tc>
           <w:tcPr>
-            <w:tcW w:type="dxa" w:w="675"/>
+            <w:tcW w:type="dxa" w:w="633"/>
           </w:tcPr>
           <w:p>
             <w:r/>
@@ -8430,7 +8236,7 @@
         </w:tc>
         <w:tc>
           <w:tcPr>
-            <w:tcW w:type="dxa" w:w="1638"/>
+            <w:tcW w:type="dxa" w:w="1606"/>
           </w:tcPr>
           <w:p>
             <w:r/>
@@ -8447,7 +8253,7 @@
       <w:tr>
         <w:tc>
           <w:tcPr>
-            <w:tcW w:type="dxa" w:w="2024"/>
+            <w:tcW w:type="dxa" w:w="2336"/>
           </w:tcPr>
           <w:p>
             <w:r/>
@@ -8462,7 +8268,7 @@
         </w:tc>
         <w:tc>
           <w:tcPr>
-            <w:tcW w:type="dxa" w:w="1253"/>
+            <w:tcW w:type="dxa" w:w="1266"/>
           </w:tcPr>
           <w:p>
             <w:r/>
@@ -8477,7 +8283,7 @@
         </w:tc>
         <w:tc>
           <w:tcPr>
-            <w:tcW w:type="dxa" w:w="675"/>
+            <w:tcW w:type="dxa" w:w="633"/>
           </w:tcPr>
           <w:p>
             <w:r/>
@@ -8492,7 +8298,7 @@
         </w:tc>
         <w:tc>
           <w:tcPr>
-            <w:tcW w:type="dxa" w:w="675"/>
+            <w:tcW w:type="dxa" w:w="633"/>
           </w:tcPr>
           <w:p>
             <w:r/>
@@ -8507,7 +8313,7 @@
         </w:tc>
         <w:tc>
           <w:tcPr>
-            <w:tcW w:type="dxa" w:w="675"/>
+            <w:tcW w:type="dxa" w:w="633"/>
           </w:tcPr>
           <w:p>
             <w:r/>
@@ -8522,7 +8328,7 @@
         </w:tc>
         <w:tc>
           <w:tcPr>
-            <w:tcW w:type="dxa" w:w="675"/>
+            <w:tcW w:type="dxa" w:w="633"/>
           </w:tcPr>
           <w:p>
             <w:r/>
@@ -8537,7 +8343,7 @@
         </w:tc>
         <w:tc>
           <w:tcPr>
-            <w:tcW w:type="dxa" w:w="675"/>
+            <w:tcW w:type="dxa" w:w="633"/>
           </w:tcPr>
           <w:p>
             <w:r/>
@@ -8552,7 +8358,7 @@
         </w:tc>
         <w:tc>
           <w:tcPr>
-            <w:tcW w:type="dxa" w:w="675"/>
+            <w:tcW w:type="dxa" w:w="633"/>
           </w:tcPr>
           <w:p>
             <w:r/>
@@ -8567,7 +8373,7 @@
         </w:tc>
         <w:tc>
           <w:tcPr>
-            <w:tcW w:type="dxa" w:w="675"/>
+            <w:tcW w:type="dxa" w:w="633"/>
           </w:tcPr>
           <w:p>
             <w:r/>
@@ -8582,7 +8388,7 @@
         </w:tc>
         <w:tc>
           <w:tcPr>
-            <w:tcW w:type="dxa" w:w="1638"/>
+            <w:tcW w:type="dxa" w:w="1606"/>
           </w:tcPr>
           <w:p>
             <w:r/>
@@ -8599,7 +8405,7 @@
       <w:tr>
         <w:tc>
           <w:tcPr>
-            <w:tcW w:type="dxa" w:w="2024"/>
+            <w:tcW w:type="dxa" w:w="2336"/>
           </w:tcPr>
           <w:p>
             <w:r/>
@@ -8614,7 +8420,7 @@
         </w:tc>
         <w:tc>
           <w:tcPr>
-            <w:tcW w:type="dxa" w:w="1253"/>
+            <w:tcW w:type="dxa" w:w="1266"/>
           </w:tcPr>
           <w:p>
             <w:r/>
@@ -8629,7 +8435,7 @@
         </w:tc>
         <w:tc>
           <w:tcPr>
-            <w:tcW w:type="dxa" w:w="675"/>
+            <w:tcW w:type="dxa" w:w="633"/>
           </w:tcPr>
           <w:p>
             <w:r/>
@@ -8644,7 +8450,7 @@
         </w:tc>
         <w:tc>
           <w:tcPr>
-            <w:tcW w:type="dxa" w:w="675"/>
+            <w:tcW w:type="dxa" w:w="633"/>
           </w:tcPr>
           <w:p>
             <w:r/>
@@ -8659,7 +8465,7 @@
         </w:tc>
         <w:tc>
           <w:tcPr>
-            <w:tcW w:type="dxa" w:w="675"/>
+            <w:tcW w:type="dxa" w:w="633"/>
           </w:tcPr>
           <w:p>
             <w:r/>
@@ -8674,7 +8480,7 @@
         </w:tc>
         <w:tc>
           <w:tcPr>
-            <w:tcW w:type="dxa" w:w="675"/>
+            <w:tcW w:type="dxa" w:w="633"/>
           </w:tcPr>
           <w:p>
             <w:r/>
@@ -8689,7 +8495,7 @@
         </w:tc>
         <w:tc>
           <w:tcPr>
-            <w:tcW w:type="dxa" w:w="675"/>
+            <w:tcW w:type="dxa" w:w="633"/>
           </w:tcPr>
           <w:p>
             <w:r/>
@@ -8704,7 +8510,7 @@
         </w:tc>
         <w:tc>
           <w:tcPr>
-            <w:tcW w:type="dxa" w:w="675"/>
+            <w:tcW w:type="dxa" w:w="633"/>
           </w:tcPr>
           <w:p>
             <w:r/>
@@ -8719,7 +8525,7 @@
         </w:tc>
         <w:tc>
           <w:tcPr>
-            <w:tcW w:type="dxa" w:w="675"/>
+            <w:tcW w:type="dxa" w:w="633"/>
           </w:tcPr>
           <w:p>
             <w:r/>
@@ -8734,7 +8540,7 @@
         </w:tc>
         <w:tc>
           <w:tcPr>
-            <w:tcW w:type="dxa" w:w="1638"/>
+            <w:tcW w:type="dxa" w:w="1606"/>
           </w:tcPr>
           <w:p>
             <w:r/>
@@ -8751,7 +8557,7 @@
       <w:tr>
         <w:tc>
           <w:tcPr>
-            <w:tcW w:type="dxa" w:w="2024"/>
+            <w:tcW w:type="dxa" w:w="2336"/>
           </w:tcPr>
           <w:p>
             <w:r/>
@@ -8766,7 +8572,7 @@
         </w:tc>
         <w:tc>
           <w:tcPr>
-            <w:tcW w:type="dxa" w:w="1253"/>
+            <w:tcW w:type="dxa" w:w="1266"/>
           </w:tcPr>
           <w:p>
             <w:r/>
@@ -8781,7 +8587,7 @@
         </w:tc>
         <w:tc>
           <w:tcPr>
-            <w:tcW w:type="dxa" w:w="675"/>
+            <w:tcW w:type="dxa" w:w="633"/>
           </w:tcPr>
           <w:p>
             <w:r/>
@@ -8796,7 +8602,7 @@
         </w:tc>
         <w:tc>
           <w:tcPr>
-            <w:tcW w:type="dxa" w:w="675"/>
+            <w:tcW w:type="dxa" w:w="633"/>
           </w:tcPr>
           <w:p>
             <w:r/>
@@ -8811,7 +8617,7 @@
         </w:tc>
         <w:tc>
           <w:tcPr>
-            <w:tcW w:type="dxa" w:w="675"/>
+            <w:tcW w:type="dxa" w:w="633"/>
           </w:tcPr>
           <w:p>
             <w:r/>
@@ -8826,7 +8632,7 @@
         </w:tc>
         <w:tc>
           <w:tcPr>
-            <w:tcW w:type="dxa" w:w="675"/>
+            <w:tcW w:type="dxa" w:w="633"/>
           </w:tcPr>
           <w:p>
             <w:r/>
@@ -8841,7 +8647,7 @@
         </w:tc>
         <w:tc>
           <w:tcPr>
-            <w:tcW w:type="dxa" w:w="675"/>
+            <w:tcW w:type="dxa" w:w="633"/>
           </w:tcPr>
           <w:p>
             <w:r/>
@@ -8856,7 +8662,7 @@
         </w:tc>
         <w:tc>
           <w:tcPr>
-            <w:tcW w:type="dxa" w:w="675"/>
+            <w:tcW w:type="dxa" w:w="633"/>
           </w:tcPr>
           <w:p>
             <w:r/>
@@ -8871,7 +8677,7 @@
         </w:tc>
         <w:tc>
           <w:tcPr>
-            <w:tcW w:type="dxa" w:w="675"/>
+            <w:tcW w:type="dxa" w:w="633"/>
           </w:tcPr>
           <w:p>
             <w:r/>
@@ -8886,7 +8692,7 @@
         </w:tc>
         <w:tc>
           <w:tcPr>
-            <w:tcW w:type="dxa" w:w="1638"/>
+            <w:tcW w:type="dxa" w:w="1606"/>
           </w:tcPr>
           <w:p>
             <w:r/>
@@ -8903,7 +8709,7 @@
       <w:tr>
         <w:tc>
           <w:tcPr>
-            <w:tcW w:type="dxa" w:w="2024"/>
+            <w:tcW w:type="dxa" w:w="2336"/>
           </w:tcPr>
           <w:p>
             <w:r/>
@@ -8918,7 +8724,7 @@
         </w:tc>
         <w:tc>
           <w:tcPr>
-            <w:tcW w:type="dxa" w:w="1253"/>
+            <w:tcW w:type="dxa" w:w="1266"/>
           </w:tcPr>
           <w:p>
             <w:r/>
@@ -8933,7 +8739,7 @@
         </w:tc>
         <w:tc>
           <w:tcPr>
-            <w:tcW w:type="dxa" w:w="675"/>
+            <w:tcW w:type="dxa" w:w="633"/>
           </w:tcPr>
           <w:p>
             <w:r/>
@@ -8948,7 +8754,7 @@
         </w:tc>
         <w:tc>
           <w:tcPr>
-            <w:tcW w:type="dxa" w:w="675"/>
+            <w:tcW w:type="dxa" w:w="633"/>
           </w:tcPr>
           <w:p>
             <w:r/>
@@ -8963,7 +8769,7 @@
         </w:tc>
         <w:tc>
           <w:tcPr>
-            <w:tcW w:type="dxa" w:w="675"/>
+            <w:tcW w:type="dxa" w:w="633"/>
           </w:tcPr>
           <w:p>
             <w:r/>
@@ -8978,7 +8784,7 @@
         </w:tc>
         <w:tc>
           <w:tcPr>
-            <w:tcW w:type="dxa" w:w="675"/>
+            <w:tcW w:type="dxa" w:w="633"/>
           </w:tcPr>
           <w:p>
             <w:r/>
@@ -8993,7 +8799,7 @@
         </w:tc>
         <w:tc>
           <w:tcPr>
-            <w:tcW w:type="dxa" w:w="675"/>
+            <w:tcW w:type="dxa" w:w="633"/>
           </w:tcPr>
           <w:p>
             <w:r/>
@@ -9008,7 +8814,7 @@
         </w:tc>
         <w:tc>
           <w:tcPr>
-            <w:tcW w:type="dxa" w:w="675"/>
+            <w:tcW w:type="dxa" w:w="633"/>
           </w:tcPr>
           <w:p>
             <w:r/>
@@ -9023,7 +8829,7 @@
         </w:tc>
         <w:tc>
           <w:tcPr>
-            <w:tcW w:type="dxa" w:w="675"/>
+            <w:tcW w:type="dxa" w:w="633"/>
           </w:tcPr>
           <w:p>
             <w:r/>
@@ -9038,7 +8844,7 @@
         </w:tc>
         <w:tc>
           <w:tcPr>
-            <w:tcW w:type="dxa" w:w="1638"/>
+            <w:tcW w:type="dxa" w:w="1606"/>
           </w:tcPr>
           <w:p>
             <w:r/>
@@ -9055,7 +8861,7 @@
       <w:tr>
         <w:tc>
           <w:tcPr>
-            <w:tcW w:type="dxa" w:w="2024"/>
+            <w:tcW w:type="dxa" w:w="2336"/>
           </w:tcPr>
           <w:p>
             <w:r/>
@@ -9070,7 +8876,7 @@
         </w:tc>
         <w:tc>
           <w:tcPr>
-            <w:tcW w:type="dxa" w:w="1253"/>
+            <w:tcW w:type="dxa" w:w="1266"/>
           </w:tcPr>
           <w:p>
             <w:r/>
@@ -9085,7 +8891,7 @@
         </w:tc>
         <w:tc>
           <w:tcPr>
-            <w:tcW w:type="dxa" w:w="675"/>
+            <w:tcW w:type="dxa" w:w="633"/>
           </w:tcPr>
           <w:p>
             <w:r/>
@@ -9100,7 +8906,7 @@
         </w:tc>
         <w:tc>
           <w:tcPr>
-            <w:tcW w:type="dxa" w:w="675"/>
+            <w:tcW w:type="dxa" w:w="633"/>
           </w:tcPr>
           <w:p>
             <w:r/>
@@ -9115,7 +8921,7 @@
         </w:tc>
         <w:tc>
           <w:tcPr>
-            <w:tcW w:type="dxa" w:w="675"/>
+            <w:tcW w:type="dxa" w:w="633"/>
           </w:tcPr>
           <w:p>
             <w:r/>
@@ -9130,7 +8936,7 @@
         </w:tc>
         <w:tc>
           <w:tcPr>
-            <w:tcW w:type="dxa" w:w="675"/>
+            <w:tcW w:type="dxa" w:w="633"/>
           </w:tcPr>
           <w:p>
             <w:r/>
@@ -9145,7 +8951,7 @@
         </w:tc>
         <w:tc>
           <w:tcPr>
-            <w:tcW w:type="dxa" w:w="675"/>
+            <w:tcW w:type="dxa" w:w="633"/>
           </w:tcPr>
           <w:p>
             <w:r/>
@@ -9160,7 +8966,7 @@
         </w:tc>
         <w:tc>
           <w:tcPr>
-            <w:tcW w:type="dxa" w:w="675"/>
+            <w:tcW w:type="dxa" w:w="633"/>
           </w:tcPr>
           <w:p>
             <w:r/>
@@ -9175,7 +8981,7 @@
         </w:tc>
         <w:tc>
           <w:tcPr>
-            <w:tcW w:type="dxa" w:w="675"/>
+            <w:tcW w:type="dxa" w:w="633"/>
           </w:tcPr>
           <w:p>
             <w:r/>
@@ -9190,7 +8996,7 @@
         </w:tc>
         <w:tc>
           <w:tcPr>
-            <w:tcW w:type="dxa" w:w="1638"/>
+            <w:tcW w:type="dxa" w:w="1606"/>
           </w:tcPr>
           <w:p>
             <w:r/>
@@ -9207,7 +9013,7 @@
       <w:tr>
         <w:tc>
           <w:tcPr>
-            <w:tcW w:type="dxa" w:w="2024"/>
+            <w:tcW w:type="dxa" w:w="2336"/>
           </w:tcPr>
           <w:p>
             <w:r/>
@@ -9222,7 +9028,7 @@
         </w:tc>
         <w:tc>
           <w:tcPr>
-            <w:tcW w:type="dxa" w:w="1253"/>
+            <w:tcW w:type="dxa" w:w="1266"/>
           </w:tcPr>
           <w:p>
             <w:r/>
@@ -9237,7 +9043,7 @@
         </w:tc>
         <w:tc>
           <w:tcPr>
-            <w:tcW w:type="dxa" w:w="675"/>
+            <w:tcW w:type="dxa" w:w="633"/>
           </w:tcPr>
           <w:p>
             <w:r/>
@@ -9252,7 +9058,7 @@
         </w:tc>
         <w:tc>
           <w:tcPr>
-            <w:tcW w:type="dxa" w:w="675"/>
+            <w:tcW w:type="dxa" w:w="633"/>
           </w:tcPr>
           <w:p>
             <w:r/>
@@ -9267,7 +9073,7 @@
         </w:tc>
         <w:tc>
           <w:tcPr>
-            <w:tcW w:type="dxa" w:w="675"/>
+            <w:tcW w:type="dxa" w:w="633"/>
           </w:tcPr>
           <w:p>
             <w:r/>
@@ -9282,7 +9088,7 @@
         </w:tc>
         <w:tc>
           <w:tcPr>
-            <w:tcW w:type="dxa" w:w="675"/>
+            <w:tcW w:type="dxa" w:w="633"/>
           </w:tcPr>
           <w:p>
             <w:r/>
@@ -9297,7 +9103,7 @@
         </w:tc>
         <w:tc>
           <w:tcPr>
-            <w:tcW w:type="dxa" w:w="675"/>
+            <w:tcW w:type="dxa" w:w="633"/>
           </w:tcPr>
           <w:p>
             <w:r/>
@@ -9312,7 +9118,7 @@
         </w:tc>
         <w:tc>
           <w:tcPr>
-            <w:tcW w:type="dxa" w:w="675"/>
+            <w:tcW w:type="dxa" w:w="633"/>
           </w:tcPr>
           <w:p>
             <w:r/>
@@ -9327,7 +9133,7 @@
         </w:tc>
         <w:tc>
           <w:tcPr>
-            <w:tcW w:type="dxa" w:w="675"/>
+            <w:tcW w:type="dxa" w:w="633"/>
           </w:tcPr>
           <w:p>
             <w:r/>
@@ -9342,7 +9148,7 @@
         </w:tc>
         <w:tc>
           <w:tcPr>
-            <w:tcW w:type="dxa" w:w="1638"/>
+            <w:tcW w:type="dxa" w:w="1606"/>
           </w:tcPr>
           <w:p>
             <w:r/>
@@ -9359,7 +9165,7 @@
       <w:tr>
         <w:tc>
           <w:tcPr>
-            <w:tcW w:type="dxa" w:w="2024"/>
+            <w:tcW w:type="dxa" w:w="2336"/>
           </w:tcPr>
           <w:p>
             <w:r/>
@@ -9374,7 +9180,7 @@
         </w:tc>
         <w:tc>
           <w:tcPr>
-            <w:tcW w:type="dxa" w:w="1253"/>
+            <w:tcW w:type="dxa" w:w="1266"/>
           </w:tcPr>
           <w:p>
             <w:r/>
@@ -9397,7 +9203,7 @@
         </w:tc>
         <w:tc>
           <w:tcPr>
-            <w:tcW w:type="dxa" w:w="675"/>
+            <w:tcW w:type="dxa" w:w="633"/>
           </w:tcPr>
           <w:p>
             <w:r/>
@@ -9412,7 +9218,7 @@
         </w:tc>
         <w:tc>
           <w:tcPr>
-            <w:tcW w:type="dxa" w:w="675"/>
+            <w:tcW w:type="dxa" w:w="633"/>
           </w:tcPr>
           <w:p>
             <w:r/>
@@ -9427,7 +9233,7 @@
         </w:tc>
         <w:tc>
           <w:tcPr>
-            <w:tcW w:type="dxa" w:w="675"/>
+            <w:tcW w:type="dxa" w:w="633"/>
           </w:tcPr>
           <w:p>
             <w:r/>
@@ -9442,7 +9248,7 @@
         </w:tc>
         <w:tc>
           <w:tcPr>
-            <w:tcW w:type="dxa" w:w="675"/>
+            <w:tcW w:type="dxa" w:w="633"/>
           </w:tcPr>
           <w:p>
             <w:r/>
@@ -9457,7 +9263,7 @@
         </w:tc>
         <w:tc>
           <w:tcPr>
-            <w:tcW w:type="dxa" w:w="675"/>
+            <w:tcW w:type="dxa" w:w="633"/>
           </w:tcPr>
           <w:p>
             <w:r/>
@@ -9472,7 +9278,7 @@
         </w:tc>
         <w:tc>
           <w:tcPr>
-            <w:tcW w:type="dxa" w:w="675"/>
+            <w:tcW w:type="dxa" w:w="633"/>
           </w:tcPr>
           <w:p>
             <w:r/>
@@ -9487,7 +9293,7 @@
         </w:tc>
         <w:tc>
           <w:tcPr>
-            <w:tcW w:type="dxa" w:w="675"/>
+            <w:tcW w:type="dxa" w:w="633"/>
           </w:tcPr>
           <w:p>
             <w:r/>
@@ -9502,7 +9308,7 @@
         </w:tc>
         <w:tc>
           <w:tcPr>
-            <w:tcW w:type="dxa" w:w="1638"/>
+            <w:tcW w:type="dxa" w:w="1606"/>
           </w:tcPr>
           <w:p>
             <w:r/>
@@ -16451,357 +16257,6 @@
         <w:spacing w:after="80"/>
       </w:pPr>
     </w:p>
-    <w:p>
-      <w:pPr>
-        <w:spacing w:after="60" w:before="200"/>
-      </w:pPr>
-      <w:r>
-        <w:rPr>
-          <w:rFonts w:ascii="Arial" w:hAnsi="Arial"/>
-          <w:b/>
-          <w:i w:val="0"/>
-          <w:color w:val="0F172A"/>
-          <w:sz w:val="26"/>
-        </w:rPr>
-        <w:t>Appendix C. Verification report</w:t>
-      </w:r>
-    </w:p>
-    <w:p>
-      <w:pPr>
-        <w:keepNext/>
-        <w:spacing w:after="40"/>
-      </w:pPr>
-      <w:r>
-        <w:rPr>
-          <w:b w:val="0"/>
-          <w:i w:val="0"/>
-          <w:color w:val="2A3142"/>
-          <w:sz w:val="17"/>
-        </w:rPr>
-        <w:t>Table C1. Final verification.</w:t>
-      </w:r>
-    </w:p>
-    <w:tbl>
-      <w:tblPr>
-        <w:tblStyle w:val="TableGrid"/>
-        <w:tblW w:type="auto" w:w="0"/>
-        <w:tblLook w:firstColumn="1" w:firstRow="1" w:lastColumn="0" w:lastRow="0" w:noHBand="0" w:noVBand="1" w:val="04A0"/>
-      </w:tblPr>
-      <w:tblGrid>
-        <w:gridCol w:w="4819"/>
-        <w:gridCol w:w="4819"/>
-      </w:tblGrid>
-      <w:tr>
-        <w:tc>
-          <w:tcPr>
-            <w:tcW w:type="dxa" w:w="2699"/>
-            <w:shd w:val="clear" w:color="auto" w:fill="EEF2F7"/>
-          </w:tcPr>
-          <w:p>
-            <w:r/>
-            <w:r>
-              <w:rPr>
-                <w:b/>
-                <w:sz w:val="15"/>
-              </w:rPr>
-              <w:t>Check</w:t>
-            </w:r>
-          </w:p>
-        </w:tc>
-        <w:tc>
-          <w:tcPr>
-            <w:tcW w:type="dxa" w:w="6939"/>
-            <w:shd w:val="clear" w:color="auto" w:fill="EEF2F7"/>
-          </w:tcPr>
-          <w:p>
-            <w:r/>
-            <w:r>
-              <w:rPr>
-                <w:b/>
-                <w:sz w:val="15"/>
-              </w:rPr>
-              <w:t>Result</w:t>
-            </w:r>
-          </w:p>
-        </w:tc>
-      </w:tr>
-      <w:tr>
-        <w:tc>
-          <w:tcPr>
-            <w:tcW w:type="dxa" w:w="2699"/>
-          </w:tcPr>
-          <w:p>
-            <w:r/>
-            <w:r>
-              <w:rPr>
-                <w:b w:val="0"/>
-                <w:sz w:val="15"/>
-              </w:rPr>
-              <w:t>Fabricated values</w:t>
-            </w:r>
-          </w:p>
-        </w:tc>
-        <w:tc>
-          <w:tcPr>
-            <w:tcW w:type="dxa" w:w="6939"/>
-          </w:tcPr>
-          <w:p>
-            <w:r/>
-            <w:r>
-              <w:rPr>
-                <w:b w:val="0"/>
-                <w:sz w:val="15"/>
-              </w:rPr>
-              <w:t>NONE. Every number is read from a saved result file or recomputed from saved per-impact predictions at build time</w:t>
-            </w:r>
-          </w:p>
-        </w:tc>
-      </w:tr>
-      <w:tr>
-        <w:tc>
-          <w:tcPr>
-            <w:tcW w:type="dxa" w:w="2699"/>
-          </w:tcPr>
-          <w:p>
-            <w:r/>
-            <w:r>
-              <w:rPr>
-                <w:b w:val="0"/>
-                <w:sz w:val="15"/>
-              </w:rPr>
-              <w:t>Unverified models in the benchmark</w:t>
-            </w:r>
-          </w:p>
-        </w:tc>
-        <w:tc>
-          <w:tcPr>
-            <w:tcW w:type="dxa" w:w="6939"/>
-          </w:tcPr>
-          <w:p>
-            <w:r/>
-            <w:r>
-              <w:rPr>
-                <w:b w:val="0"/>
-                <w:sz w:val="15"/>
-              </w:rPr>
-              <w:t>NONE. Only implemented and evaluated models appear in Tables 5–6; planned work is in Table 8</w:t>
-            </w:r>
-          </w:p>
-        </w:tc>
-      </w:tr>
-      <w:tr>
-        <w:tc>
-          <w:tcPr>
-            <w:tcW w:type="dxa" w:w="2699"/>
-          </w:tcPr>
-          <w:p>
-            <w:r/>
-            <w:r>
-              <w:rPr>
-                <w:b w:val="0"/>
-                <w:sz w:val="15"/>
-              </w:rPr>
-              <w:t>Metrics recomputed</w:t>
-            </w:r>
-          </w:p>
-        </w:tc>
-        <w:tc>
-          <w:tcPr>
-            <w:tcW w:type="dxa" w:w="6939"/>
-          </w:tcPr>
-          <w:p>
-            <w:r/>
-            <w:r>
-              <w:rPr>
-                <w:b w:val="0"/>
-                <w:sz w:val="15"/>
-              </w:rPr>
-              <w:t>RMSE/MAE/R² recomputed from per-impact predictions for 7 v1 models, 4 v2 GP variants and 5 extension models; REF-H RMSE of all 13 screened models recomputed from saved predictions and matches zoo_table.csv</w:t>
-            </w:r>
-          </w:p>
-        </w:tc>
-      </w:tr>
-      <w:tr>
-        <w:tc>
-          <w:tcPr>
-            <w:tcW w:type="dxa" w:w="2699"/>
-          </w:tcPr>
-          <w:p>
-            <w:r/>
-            <w:r>
-              <w:rPr>
-                <w:b w:val="0"/>
-                <w:sz w:val="15"/>
-              </w:rPr>
-              <w:t>Cross-checks</w:t>
-            </w:r>
-          </w:p>
-        </w:tc>
-        <w:tc>
-          <w:tcPr>
-            <w:tcW w:type="dxa" w:w="6939"/>
-          </w:tcPr>
-          <w:p>
-            <w:r/>
-            <w:r>
-              <w:rPr>
-                <w:b w:val="0"/>
-                <w:sz w:val="15"/>
-              </w:rPr>
-              <w:t>v1 GP LOSO RMSE 0.03997278 vs v2 re-implementation 0.03997278; browser vs Python β</w:t>
-            </w:r>
-            <w:r>
-              <w:rPr>
-                <w:b w:val="0"/>
-                <w:sz w:val="15"/>
-                <w:vertAlign w:val="subscript"/>
-              </w:rPr>
-              <w:t>max</w:t>
-            </w:r>
-            <w:r>
-              <w:rPr>
-                <w:b w:val="0"/>
-                <w:sz w:val="15"/>
-              </w:rPr>
-              <w:t xml:space="preserve"> 2.7e-12</w:t>
-            </w:r>
-          </w:p>
-        </w:tc>
-      </w:tr>
-      <w:tr>
-        <w:tc>
-          <w:tcPr>
-            <w:tcW w:type="dxa" w:w="2699"/>
-          </w:tcPr>
-          <w:p>
-            <w:r/>
-            <w:r>
-              <w:rPr>
-                <w:b w:val="0"/>
-                <w:sz w:val="15"/>
-              </w:rPr>
-              <w:t>Re-run in this study</w:t>
-            </w:r>
-          </w:p>
-        </w:tc>
-        <w:tc>
-          <w:tcPr>
-            <w:tcW w:type="dxa" w:w="6939"/>
-          </w:tcPr>
-          <w:p>
-            <w:r/>
-            <w:r>
-              <w:rPr>
-                <w:b w:val="0"/>
-                <w:sz w:val="15"/>
-              </w:rPr>
-              <w:t>dimensional-input GP (reproduces 0.0372 of the archived phase-2 run), bootstrap intervals, latency, video checks</w:t>
-            </w:r>
-          </w:p>
-        </w:tc>
-      </w:tr>
-      <w:tr>
-        <w:tc>
-          <w:tcPr>
-            <w:tcW w:type="dxa" w:w="2699"/>
-          </w:tcPr>
-          <w:p>
-            <w:r/>
-            <w:r>
-              <w:rPr>
-                <w:b w:val="0"/>
-                <w:sz w:val="15"/>
-              </w:rPr>
-              <w:t>Latency claims</w:t>
-            </w:r>
-          </w:p>
-        </w:tc>
-        <w:tc>
-          <w:tcPr>
-            <w:tcW w:type="dxa" w:w="6939"/>
-          </w:tcPr>
-          <w:p>
-            <w:r/>
-            <w:r>
-              <w:rPr>
-                <w:b w:val="0"/>
-                <w:sz w:val="15"/>
-              </w:rPr>
-              <w:t>measured (Table 7); no capture-to-result real-time claim</w:t>
-            </w:r>
-          </w:p>
-        </w:tc>
-      </w:tr>
-      <w:tr>
-        <w:tc>
-          <w:tcPr>
-            <w:tcW w:type="dxa" w:w="2699"/>
-          </w:tcPr>
-          <w:p>
-            <w:r/>
-            <w:r>
-              <w:rPr>
-                <w:b w:val="0"/>
-                <w:sz w:val="15"/>
-              </w:rPr>
-              <w:t>References</w:t>
-            </w:r>
-          </w:p>
-        </w:tc>
-        <w:tc>
-          <w:tcPr>
-            <w:tcW w:type="dxa" w:w="6939"/>
-          </w:tcPr>
-          <w:p>
-            <w:r/>
-            <w:r>
-              <w:rPr>
-                <w:b w:val="0"/>
-                <w:sz w:val="15"/>
-              </w:rPr>
-              <w:t>15, all cited in the text; none added without a verifiable source</w:t>
-            </w:r>
-          </w:p>
-        </w:tc>
-      </w:tr>
-      <w:tr>
-        <w:tc>
-          <w:tcPr>
-            <w:tcW w:type="dxa" w:w="2699"/>
-          </w:tcPr>
-          <w:p>
-            <w:r/>
-            <w:r>
-              <w:rPr>
-                <w:b w:val="0"/>
-                <w:sz w:val="15"/>
-              </w:rPr>
-              <w:t>Corrections to earlier drafts</w:t>
-            </w:r>
-          </w:p>
-        </w:tc>
-        <w:tc>
-          <w:tcPr>
-            <w:tcW w:type="dxa" w:w="6939"/>
-          </w:tcPr>
-          <w:p>
-            <w:r/>
-            <w:r>
-              <w:rPr>
-                <w:b w:val="0"/>
-                <w:sz w:val="15"/>
-              </w:rPr>
-              <w:t>Laan-backbone improvement is not significant with surfaces resampled; dimensional inputs are lower but not significant; browser video timing bug found and fixed</w:t>
-            </w:r>
-          </w:p>
-        </w:tc>
-      </w:tr>
-    </w:tbl>
-    <w:p>
-      <w:pPr>
-        <w:spacing w:after="80"/>
-      </w:pPr>
-    </w:p>
     <w:sectPr>
       <w:pgSz w:w="11906" w:h="16838"/>
       <w:pgMar w:top="1134" w:right="1134" w:bottom="1134" w:left="1134" w:header="720" w:footer="720" w:gutter="0"/>

</xml_diff>